<commit_message>
created all tasks for lab02
</commit_message>
<xml_diff>
--- a/Labs/Lab 2/Lab 02 Doc.docx
+++ b/Labs/Lab 2/Lab 02 Doc.docx
@@ -269,7 +269,6 @@
           <w:szCs w:val="32"/>
         </w:rPr>
       </w:pPr>
-      <w:proofErr w:type="spellStart"/>
       <w:r>
         <w:rPr>
           <w:b/>
@@ -277,17 +276,7 @@
           <w:sz w:val="32"/>
           <w:szCs w:val="32"/>
         </w:rPr>
-        <w:t>Lms</w:t>
-      </w:r>
-      <w:proofErr w:type="spellEnd"/>
-      <w:r>
-        <w:rPr>
-          <w:b/>
-          <w:bCs/>
-          <w:sz w:val="32"/>
-          <w:szCs w:val="32"/>
-        </w:rPr>
-        <w:t xml:space="preserve">  Id:</w:t>
+        <w:t>Lms  Id:</w:t>
       </w:r>
       <w:r>
         <w:rPr>
@@ -362,33 +351,6 @@
       </w:pPr>
       <w:bookmarkStart w:id="9" w:name="_alwkp4hhpbnq" w:colFirst="0" w:colLast="0"/>
       <w:bookmarkEnd w:id="9"/>
-      <w:r>
-        <w:rPr>
-          <w:b/>
-          <w:bCs/>
-          <w:sz w:val="46"/>
-          <w:szCs w:val="46"/>
-        </w:rPr>
-        <w:t>Introduction</w:t>
-      </w:r>
-    </w:p>
-    <w:p>
-      <w:pPr>
-        <w:spacing w:before="240" w:after="240"/>
-      </w:pPr>
-      <w:r>
-        <w:rPr>
-          <w:sz w:val="24"/>
-          <w:szCs w:val="24"/>
-        </w:rPr>
-        <w:lastRenderedPageBreak/>
-        <w:t xml:space="preserve">This lab introduces arrays, pointers, and dynamic memory allocation in C++ through practical programming tasks. </w:t>
-      </w:r>
-      <w:r>
-        <w:pict w14:anchorId="678A5056">
-          <v:rect id="_x0000_i1025" style="width:0;height:1.5pt" o:hralign="center" o:hrstd="t" o:hr="t" fillcolor="#a0a0a0" stroked="f"/>
-        </w:pict>
-      </w:r>
     </w:p>
     <w:p>
       <w:pPr>
@@ -403,45 +365,6 @@
           <w:szCs w:val="46"/>
         </w:rPr>
       </w:pPr>
-      <w:bookmarkStart w:id="10" w:name="_ub1qfx88snez" w:colFirst="0" w:colLast="0"/>
-      <w:bookmarkEnd w:id="10"/>
-      <w:r>
-        <w:rPr>
-          <w:b/>
-          <w:bCs/>
-          <w:sz w:val="46"/>
-          <w:szCs w:val="46"/>
-        </w:rPr>
-        <w:t>Objectives</w:t>
-      </w:r>
-    </w:p>
-    <w:p>
-      <w:pPr>
-        <w:spacing w:before="240" w:after="240"/>
-        <w:rPr>
-          <w:sz w:val="24"/>
-          <w:szCs w:val="24"/>
-          <w:lang w:val="en-PK"/>
-        </w:rPr>
-      </w:pPr>
-      <w:r>
-        <w:rPr>
-          <w:sz w:val="24"/>
-          <w:szCs w:val="24"/>
-          <w:lang w:val="en-PK"/>
-        </w:rPr>
-        <w:t xml:space="preserve">To understand and implement static and dynamic arrays, pointer expressions, 1D and 2D arrays, dynamic memory allocation, resizing, and safe memory deallocation in C++. </w:t>
-      </w:r>
-    </w:p>
-    <w:p>
-      <w:pPr>
-        <w:spacing w:before="240" w:after="240"/>
-      </w:pPr>
-      <w:r>
-        <w:pict w14:anchorId="480B0E03">
-          <v:rect id="_x0000_i1026" style="width:0;height:1.5pt" o:hralign="center" o:hrstd="t" o:hr="t" fillcolor="#a0a0a0" stroked="f"/>
-        </w:pict>
-      </w:r>
     </w:p>
     <w:p>
       <w:pPr>
@@ -456,6 +379,99 @@
           <w:szCs w:val="46"/>
         </w:rPr>
       </w:pPr>
+      <w:r>
+        <w:rPr>
+          <w:b/>
+          <w:bCs/>
+          <w:sz w:val="46"/>
+          <w:szCs w:val="46"/>
+        </w:rPr>
+        <w:t>Introduction</w:t>
+      </w:r>
+    </w:p>
+    <w:p>
+      <w:pPr>
+        <w:spacing w:before="240" w:after="240"/>
+      </w:pPr>
+      <w:r>
+        <w:rPr>
+          <w:sz w:val="24"/>
+          <w:szCs w:val="24"/>
+        </w:rPr>
+        <w:t xml:space="preserve">This lab introduces arrays, pointers, and dynamic memory allocation in C++ through practical programming tasks. </w:t>
+      </w:r>
+      <w:r>
+        <w:pict w14:anchorId="678A5056">
+          <v:rect id="_x0000_i1025" style="width:0;height:1.5pt" o:hralign="center" o:hrstd="t" o:hr="t" fillcolor="#a0a0a0" stroked="f"/>
+        </w:pict>
+      </w:r>
+    </w:p>
+    <w:p>
+      <w:pPr>
+        <w:pStyle w:val="Heading1"/>
+        <w:keepNext w:val="0"/>
+        <w:keepLines w:val="0"/>
+        <w:spacing w:before="480"/>
+        <w:rPr>
+          <w:b/>
+          <w:bCs/>
+          <w:sz w:val="46"/>
+          <w:szCs w:val="46"/>
+        </w:rPr>
+      </w:pPr>
+      <w:bookmarkStart w:id="10" w:name="_ub1qfx88snez" w:colFirst="0" w:colLast="0"/>
+      <w:bookmarkEnd w:id="10"/>
+      <w:r>
+        <w:rPr>
+          <w:b/>
+          <w:bCs/>
+          <w:sz w:val="46"/>
+          <w:szCs w:val="46"/>
+        </w:rPr>
+        <w:t>Objectives</w:t>
+      </w:r>
+    </w:p>
+    <w:p>
+      <w:pPr>
+        <w:spacing w:before="240" w:after="240"/>
+        <w:rPr>
+          <w:sz w:val="24"/>
+          <w:szCs w:val="24"/>
+          <w:lang w:val="en-PK"/>
+        </w:rPr>
+      </w:pPr>
+      <w:r>
+        <w:rPr>
+          <w:sz w:val="24"/>
+          <w:szCs w:val="24"/>
+          <w:lang w:val="en-PK"/>
+        </w:rPr>
+        <w:t xml:space="preserve">To understand and implement static and dynamic arrays, pointer expressions, 1D and 2D arrays, dynamic memory allocation, resizing, and safe memory deallocation in C++. </w:t>
+      </w:r>
+    </w:p>
+    <w:p>
+      <w:pPr>
+        <w:spacing w:before="240" w:after="240"/>
+      </w:pPr>
+      <w:r>
+        <w:pict w14:anchorId="480B0E03">
+          <v:rect id="_x0000_i1026" style="width:0;height:1.5pt" o:hralign="center" o:hrstd="t" o:hr="t" fillcolor="#a0a0a0" stroked="f"/>
+        </w:pict>
+      </w:r>
+    </w:p>
+    <w:p>
+      <w:pPr>
+        <w:pStyle w:val="Heading1"/>
+        <w:keepNext w:val="0"/>
+        <w:keepLines w:val="0"/>
+        <w:spacing w:before="480"/>
+        <w:rPr>
+          <w:b/>
+          <w:bCs/>
+          <w:sz w:val="46"/>
+          <w:szCs w:val="46"/>
+        </w:rPr>
+      </w:pPr>
       <w:bookmarkStart w:id="11" w:name="_1syhw671d60x" w:colFirst="0" w:colLast="0"/>
       <w:bookmarkEnd w:id="11"/>
       <w:r>
@@ -562,27 +578,18 @@
     <w:p>
       <w:pPr>
         <w:rPr>
+          <w:sz w:val="24"/>
+          <w:szCs w:val="24"/>
+        </w:rPr>
+      </w:pPr>
+      <w:r>
+        <w:rPr>
           <w:b/>
           <w:bCs/>
           <w:sz w:val="46"/>
           <w:szCs w:val="46"/>
         </w:rPr>
-      </w:pPr>
-    </w:p>
-    <w:p>
-      <w:pPr>
-        <w:rPr>
-          <w:sz w:val="24"/>
-          <w:szCs w:val="24"/>
-        </w:rPr>
-      </w:pPr>
-      <w:r>
-        <w:rPr>
-          <w:b/>
-          <w:bCs/>
-          <w:sz w:val="46"/>
-          <w:szCs w:val="46"/>
-        </w:rPr>
+        <w:lastRenderedPageBreak/>
         <w:t>Lab Tasks</w:t>
       </w:r>
     </w:p>
@@ -616,7 +623,9 @@
         <w:jc w:val="center"/>
       </w:pPr>
       <w:r>
-        <w:lastRenderedPageBreak/>
+        <w:rPr>
+          <w:noProof/>
+        </w:rPr>
         <w:drawing>
           <wp:inline distT="0" distB="0" distL="0" distR="0" wp14:anchorId="733C1FE9" wp14:editId="6D24BE17">
             <wp:extent cx="5943600" cy="6121400"/>
@@ -633,7 +642,7 @@
                     <pic:cNvPicPr/>
                   </pic:nvPicPr>
                   <pic:blipFill>
-                    <a:blip r:embed="rId6"/>
+                    <a:blip r:embed="rId7"/>
                     <a:stretch>
                       <a:fillRect/>
                     </a:stretch>
@@ -655,36 +664,70 @@
       </w:r>
     </w:p>
     <w:p>
+      <w:r>
+        <w:t>Explanation:</w:t>
+      </w:r>
+    </w:p>
+    <w:p>
+      <w:pPr>
+        <w:rPr>
+          <w:lang w:val="en-PK"/>
+        </w:rPr>
+      </w:pPr>
+    </w:p>
+    <w:p>
+      <w:pPr>
+        <w:rPr>
+          <w:lang w:val="en-PK"/>
+        </w:rPr>
+      </w:pPr>
+      <w:r>
+        <w:rPr>
+          <w:lang w:val="en-PK"/>
+        </w:rPr>
+        <w:t xml:space="preserve">Store sales for 5 days using an array and pointer, then update the third day's sales. </w:t>
+      </w:r>
+    </w:p>
+    <w:p>
+      <w:r>
+        <w:rPr>
+          <w:lang w:val="en-PK"/>
+        </w:rPr>
+        <w:t>“</w:t>
+      </w:r>
+      <w:r>
+        <w:rPr>
+          <w:lang w:val="en-PK"/>
+        </w:rPr>
+        <w:t>p</w:t>
+      </w:r>
+      <w:r>
+        <w:rPr>
+          <w:lang w:val="en-PK"/>
+        </w:rPr>
+        <w:t>”</w:t>
+      </w:r>
+      <w:r>
+        <w:rPr>
+          <w:lang w:val="en-PK"/>
+        </w:rPr>
+        <w:t xml:space="preserve"> stores the address of the first value. Valid indexes are 0–4; p + 5 is outside the array</w:t>
+      </w:r>
+    </w:p>
+    <w:p>
+      <w:r>
+        <w:lastRenderedPageBreak/>
+        <w:t>Output:</w:t>
+      </w:r>
+    </w:p>
+    <w:p>
       <w:pPr>
         <w:jc w:val="center"/>
       </w:pPr>
-    </w:p>
-    <w:p>
-      <w:pPr>
-        <w:jc w:val="center"/>
-      </w:pPr>
-    </w:p>
-    <w:p>
-      <w:pPr>
-        <w:jc w:val="center"/>
-      </w:pPr>
-    </w:p>
-    <w:p>
-      <w:pPr>
-        <w:jc w:val="center"/>
-      </w:pPr>
-    </w:p>
-    <w:p>
-      <w:r>
-        <w:t>Output:</w:t>
-      </w:r>
-    </w:p>
-    <w:p>
-      <w:pPr>
-        <w:jc w:val="center"/>
-      </w:pPr>
-      <w:r>
-        <w:lastRenderedPageBreak/>
+      <w:r>
+        <w:rPr>
+          <w:noProof/>
+        </w:rPr>
         <w:drawing>
           <wp:inline distT="0" distB="0" distL="0" distR="0" wp14:anchorId="2775D70F" wp14:editId="6EC81664">
             <wp:extent cx="2552831" cy="1257365"/>
@@ -701,7 +744,7 @@
                     <pic:cNvPicPr/>
                   </pic:nvPicPr>
                   <pic:blipFill>
-                    <a:blip r:embed="rId7"/>
+                    <a:blip r:embed="rId8"/>
                     <a:stretch>
                       <a:fillRect/>
                     </a:stretch>
@@ -764,13 +807,14 @@
         <w:rPr>
           <w:b/>
           <w:bCs/>
+          <w:noProof/>
           <w:sz w:val="24"/>
           <w:szCs w:val="24"/>
         </w:rPr>
         <w:drawing>
-          <wp:inline distT="0" distB="0" distL="0" distR="0" wp14:anchorId="196A24FD" wp14:editId="67D21654">
-            <wp:extent cx="4060018" cy="5716223"/>
-            <wp:effectExtent l="0" t="0" r="0" b="0"/>
+          <wp:inline distT="0" distB="0" distL="0" distR="0" wp14:anchorId="196A24FD" wp14:editId="7FBE8011">
+            <wp:extent cx="3884878" cy="5469637"/>
+            <wp:effectExtent l="0" t="0" r="1905" b="0"/>
             <wp:docPr id="1622975960" name="Picture 1"/>
             <wp:cNvGraphicFramePr>
               <a:graphicFrameLocks xmlns:a="http://schemas.openxmlformats.org/drawingml/2006/main" noChangeAspect="1"/>
@@ -783,7 +827,7 @@
                     <pic:cNvPicPr/>
                   </pic:nvPicPr>
                   <pic:blipFill>
-                    <a:blip r:embed="rId8"/>
+                    <a:blip r:embed="rId9"/>
                     <a:stretch>
                       <a:fillRect/>
                     </a:stretch>
@@ -791,7 +835,7 @@
                   <pic:spPr>
                     <a:xfrm>
                       <a:off x="0" y="0"/>
-                      <a:ext cx="4099091" cy="5771236"/>
+                      <a:ext cx="3932893" cy="5537239"/>
                     </a:xfrm>
                     <a:prstGeom prst="rect">
                       <a:avLst/>
@@ -824,6 +868,9 @@
         <w:jc w:val="center"/>
       </w:pPr>
       <w:r>
+        <w:rPr>
+          <w:noProof/>
+        </w:rPr>
         <w:drawing>
           <wp:inline distT="0" distB="0" distL="0" distR="0" wp14:anchorId="68848902" wp14:editId="3F890EDB">
             <wp:extent cx="2895749" cy="1301817"/>
@@ -840,7 +887,7 @@
                     <pic:cNvPicPr/>
                   </pic:nvPicPr>
                   <pic:blipFill>
-                    <a:blip r:embed="rId9"/>
+                    <a:blip r:embed="rId10"/>
                     <a:stretch>
                       <a:fillRect/>
                     </a:stretch>
@@ -871,6 +918,9 @@
         <w:jc w:val="center"/>
       </w:pPr>
       <w:r>
+        <w:rPr>
+          <w:noProof/>
+        </w:rPr>
         <w:drawing>
           <wp:inline distT="0" distB="0" distL="0" distR="0" wp14:anchorId="03DEFD87" wp14:editId="1CB0D905">
             <wp:extent cx="2692538" cy="1320868"/>
@@ -887,7 +937,7 @@
                     <pic:cNvPicPr/>
                   </pic:nvPicPr>
                   <pic:blipFill>
-                    <a:blip r:embed="rId10"/>
+                    <a:blip r:embed="rId11"/>
                     <a:stretch>
                       <a:fillRect/>
                     </a:stretch>
@@ -918,6 +968,9 @@
         <w:jc w:val="center"/>
       </w:pPr>
       <w:r>
+        <w:rPr>
+          <w:noProof/>
+        </w:rPr>
         <w:drawing>
           <wp:inline distT="0" distB="0" distL="0" distR="0" wp14:anchorId="377530CC" wp14:editId="25DDE192">
             <wp:extent cx="2876698" cy="406421"/>
@@ -934,7 +987,7 @@
                     <pic:cNvPicPr/>
                   </pic:nvPicPr>
                   <pic:blipFill>
-                    <a:blip r:embed="rId11"/>
+                    <a:blip r:embed="rId12"/>
                     <a:stretch>
                       <a:fillRect/>
                     </a:stretch>
@@ -955,6 +1008,12 @@
         </w:drawing>
       </w:r>
     </w:p>
+    <w:p/>
+    <w:p>
+      <w:r>
+        <w:t>Explanation:</w:t>
+      </w:r>
+    </w:p>
     <w:p>
       <w:pPr>
         <w:jc w:val="center"/>
@@ -965,29 +1024,34 @@
       </w:pPr>
       <w:r>
         <w:pict w14:anchorId="5A8EF70F">
-          <v:rect id="_x0000_i1031" style="width:0;height:1.5pt" o:hralign="center" o:hrstd="t" o:hr="t" fillcolor="#a0a0a0" stroked="f"/>
+          <v:rect id="_x0000_i1029" style="width:0;height:1.5pt" o:hralign="center" o:hrstd="t" o:hr="t" fillcolor="#a0a0a0" stroked="f"/>
         </w:pict>
       </w:r>
     </w:p>
     <w:p>
       <w:pPr>
         <w:spacing w:before="240" w:after="240"/>
-      </w:pPr>
+        <w:rPr>
+          <w:lang w:val="en-PK"/>
+        </w:rPr>
+      </w:pPr>
+      <w:r>
+        <w:rPr>
+          <w:lang w:val="en-PK"/>
+        </w:rPr>
+        <w:t xml:space="preserve">Create a marks array based on the number of students and find the total, average, and pass count. </w:t>
+      </w:r>
     </w:p>
     <w:p>
       <w:pPr>
         <w:spacing w:before="240" w:after="240"/>
       </w:pPr>
-    </w:p>
-    <w:p>
-      <w:pPr>
-        <w:spacing w:before="240" w:after="240"/>
-      </w:pPr>
-    </w:p>
-    <w:p>
-      <w:pPr>
-        <w:spacing w:before="240" w:after="240"/>
-      </w:pPr>
+      <w:r>
+        <w:rPr>
+          <w:lang w:val="en-PK"/>
+        </w:rPr>
+        <w:t>new int[n] can create an array using a runtime size. int marks[n] is not standard C++ when n is entered at runtime.</w:t>
+      </w:r>
     </w:p>
     <w:p>
       <w:pPr>
@@ -1045,25 +1109,7 @@
           <w:szCs w:val="34"/>
         </w:rPr>
         <w:lastRenderedPageBreak/>
-        <w:t xml:space="preserve">Task </w:t>
-      </w:r>
-      <w:r>
-        <w:rPr>
-          <w:b/>
-          <w:bCs/>
-          <w:sz w:val="34"/>
-          <w:szCs w:val="34"/>
-        </w:rPr>
-        <w:t>3</w:t>
-      </w:r>
-      <w:r>
-        <w:rPr>
-          <w:b/>
-          <w:bCs/>
-          <w:sz w:val="34"/>
-          <w:szCs w:val="34"/>
-        </w:rPr>
-        <w:t>:</w:t>
+        <w:t>Task 3:</w:t>
       </w:r>
     </w:p>
     <w:p>
@@ -1071,10 +1117,13 @@
         <w:jc w:val="center"/>
       </w:pPr>
       <w:r>
+        <w:rPr>
+          <w:noProof/>
+        </w:rPr>
         <w:drawing>
-          <wp:inline distT="0" distB="0" distL="0" distR="0" wp14:anchorId="3A7FA371" wp14:editId="27DFD7C2">
-            <wp:extent cx="6490623" cy="7564581"/>
-            <wp:effectExtent l="0" t="0" r="5715" b="0"/>
+          <wp:inline distT="0" distB="0" distL="0" distR="0" wp14:anchorId="3A7FA371" wp14:editId="47F8D57F">
+            <wp:extent cx="6108846" cy="7119634"/>
+            <wp:effectExtent l="0" t="0" r="6350" b="5080"/>
             <wp:docPr id="505030030" name="Picture 1"/>
             <wp:cNvGraphicFramePr>
               <a:graphicFrameLocks xmlns:a="http://schemas.openxmlformats.org/drawingml/2006/main" noChangeAspect="1"/>
@@ -1087,7 +1136,7 @@
                     <pic:cNvPicPr/>
                   </pic:nvPicPr>
                   <pic:blipFill>
-                    <a:blip r:embed="rId12"/>
+                    <a:blip r:embed="rId13"/>
                     <a:stretch>
                       <a:fillRect/>
                     </a:stretch>
@@ -1095,7 +1144,7 @@
                   <pic:spPr>
                     <a:xfrm>
                       <a:off x="0" y="0"/>
-                      <a:ext cx="6528246" cy="7608430"/>
+                      <a:ext cx="6152123" cy="7170072"/>
                     </a:xfrm>
                     <a:prstGeom prst="rect">
                       <a:avLst/>
@@ -1109,11 +1158,14 @@
       </w:r>
     </w:p>
     <w:p/>
+    <w:p/>
+    <w:p/>
     <w:p>
       <w:r>
         <w:t>Output:</w:t>
       </w:r>
     </w:p>
+    <w:p/>
     <w:p>
       <w:pPr>
         <w:jc w:val="center"/>
@@ -1122,6 +1174,7 @@
         <w:rPr>
           <w:b/>
           <w:bCs/>
+          <w:noProof/>
           <w:sz w:val="24"/>
           <w:szCs w:val="24"/>
         </w:rPr>
@@ -1141,7 +1194,7 @@
                     <pic:cNvPicPr/>
                   </pic:nvPicPr>
                   <pic:blipFill>
-                    <a:blip r:embed="rId13"/>
+                    <a:blip r:embed="rId14"/>
                     <a:stretch>
                       <a:fillRect/>
                     </a:stretch>
@@ -1164,6 +1217,44 @@
     </w:p>
     <w:p>
       <w:pPr>
+        <w:jc w:val="center"/>
+      </w:pPr>
+    </w:p>
+    <w:p>
+      <w:r>
+        <w:t>Explanation:</w:t>
+      </w:r>
+    </w:p>
+    <w:p/>
+    <w:p>
+      <w:pPr>
+        <w:rPr>
+          <w:lang w:val="en-PK"/>
+        </w:rPr>
+      </w:pPr>
+      <w:r>
+        <w:rPr>
+          <w:lang w:val="en-PK"/>
+        </w:rPr>
+        <w:t xml:space="preserve">Store sales for 2 branches and 3 days, then find branch and day totals. </w:t>
+      </w:r>
+      <w:r>
+        <w:rPr>
+          <w:lang w:val="en-PK"/>
+        </w:rPr>
+        <w:br/>
+      </w:r>
+    </w:p>
+    <w:p>
+      <w:r>
+        <w:rPr>
+          <w:lang w:val="en-PK"/>
+        </w:rPr>
+        <w:t>rowPtr + 1 moves to the next row. int** is not correct for this type of normal 2D array.</w:t>
+      </w:r>
+    </w:p>
+    <w:p>
+      <w:pPr>
         <w:rPr>
           <w:sz w:val="24"/>
           <w:szCs w:val="24"/>
@@ -1171,7 +1262,7 @@
       </w:pPr>
       <w:r>
         <w:pict w14:anchorId="3A4291BC">
-          <v:rect id="_x0000_i1032" style="width:0;height:1.5pt" o:hralign="center" o:hrstd="t" o:hr="t" fillcolor="#a0a0a0" stroked="f"/>
+          <v:rect id="_x0000_i1030" style="width:0;height:1.5pt" o:hralign="center" o:hrstd="t" o:hr="t" fillcolor="#a0a0a0" stroked="f"/>
         </w:pict>
       </w:r>
     </w:p>
@@ -1193,38 +1284,6 @@
           <w:szCs w:val="34"/>
         </w:rPr>
       </w:pPr>
-      <w:r>
-        <w:rPr>
-          <w:b/>
-          <w:bCs/>
-          <w:sz w:val="34"/>
-          <w:szCs w:val="34"/>
-        </w:rPr>
-        <w:t xml:space="preserve">Task </w:t>
-      </w:r>
-      <w:r>
-        <w:rPr>
-          <w:b/>
-          <w:bCs/>
-          <w:sz w:val="34"/>
-          <w:szCs w:val="34"/>
-        </w:rPr>
-        <w:t>4</w:t>
-      </w:r>
-      <w:r>
-        <w:rPr>
-          <w:b/>
-          <w:bCs/>
-          <w:sz w:val="34"/>
-          <w:szCs w:val="34"/>
-        </w:rPr>
-        <w:t>:</w:t>
-      </w:r>
-    </w:p>
-    <w:p>
-      <w:pPr>
-        <w:jc w:val="center"/>
-      </w:pPr>
     </w:p>
     <w:p>
       <w:pPr>
@@ -1232,41 +1291,12 @@
         <w:keepNext w:val="0"/>
         <w:keepLines w:val="0"/>
         <w:spacing w:after="80"/>
-      </w:pPr>
-      <w:r>
         <w:rPr>
           <w:b/>
           <w:bCs/>
           <w:sz w:val="34"/>
           <w:szCs w:val="34"/>
         </w:rPr>
-        <w:br/>
-      </w:r>
-      <w:r>
-        <w:rPr>
-          <w:sz w:val="34"/>
-          <w:szCs w:val="34"/>
-        </w:rPr>
-        <w:t xml:space="preserve">Output: </w:t>
-      </w:r>
-    </w:p>
-    <w:p>
-      <w:pPr>
-        <w:jc w:val="center"/>
-        <w:rPr>
-          <w:sz w:val="24"/>
-          <w:szCs w:val="24"/>
-        </w:rPr>
-      </w:pPr>
-      <w:r>
-        <w:pict w14:anchorId="171BF34E">
-          <v:rect id="_x0000_i1033" style="width:0;height:1.5pt" o:hralign="center" o:hrstd="t" o:hr="t" fillcolor="#a0a0a0" stroked="f"/>
-        </w:pict>
-      </w:r>
-    </w:p>
-    <w:p>
-      <w:pPr>
-        <w:spacing w:before="240" w:after="240"/>
       </w:pPr>
     </w:p>
     <w:p>
@@ -1275,70 +1305,12 @@
         <w:keepNext w:val="0"/>
         <w:keepLines w:val="0"/>
         <w:spacing w:after="80"/>
-      </w:pPr>
-      <w:r>
         <w:rPr>
           <w:b/>
           <w:bCs/>
           <w:sz w:val="34"/>
           <w:szCs w:val="34"/>
         </w:rPr>
-        <w:t xml:space="preserve">Task </w:t>
-      </w:r>
-      <w:r>
-        <w:rPr>
-          <w:b/>
-          <w:bCs/>
-          <w:sz w:val="34"/>
-          <w:szCs w:val="34"/>
-        </w:rPr>
-        <w:t>5</w:t>
-      </w:r>
-      <w:r>
-        <w:rPr>
-          <w:b/>
-          <w:bCs/>
-          <w:sz w:val="34"/>
-          <w:szCs w:val="34"/>
-        </w:rPr>
-        <w:t>:</w:t>
-      </w:r>
-    </w:p>
-    <w:p>
-      <w:pPr>
-        <w:spacing w:before="240" w:after="240"/>
-        <w:ind w:left="720"/>
-        <w:rPr>
-          <w:b/>
-          <w:bCs/>
-        </w:rPr>
-      </w:pPr>
-      <w:r>
-        <w:rPr>
-          <w:b/>
-          <w:bCs/>
-          <w:sz w:val="24"/>
-          <w:szCs w:val="24"/>
-        </w:rPr>
-        <w:t>DELIVERABLES GO HERE (CODE/IMAGES/OUTPUT SCREENSHOTS etc.)</w:t>
-      </w:r>
-    </w:p>
-    <w:p>
-      <w:pPr>
-        <w:rPr>
-          <w:sz w:val="24"/>
-          <w:szCs w:val="24"/>
-        </w:rPr>
-      </w:pPr>
-      <w:r>
-        <w:pict w14:anchorId="7592792F">
-          <v:rect id="_x0000_i1034" style="width:0;height:1.5pt" o:hralign="center" o:hrstd="t" o:hr="t" fillcolor="#a0a0a0" stroked="f"/>
-        </w:pict>
-      </w:r>
-    </w:p>
-    <w:p>
-      <w:pPr>
-        <w:spacing w:before="240" w:after="240"/>
       </w:pPr>
     </w:p>
     <w:p>
@@ -1347,53 +1319,1160 @@
         <w:keepNext w:val="0"/>
         <w:keepLines w:val="0"/>
         <w:spacing w:after="80"/>
-      </w:pPr>
-      <w:r>
         <w:rPr>
           <w:b/>
           <w:bCs/>
           <w:sz w:val="34"/>
           <w:szCs w:val="34"/>
         </w:rPr>
-        <w:t xml:space="preserve">Task </w:t>
-      </w:r>
-      <w:r>
+      </w:pPr>
+    </w:p>
+    <w:p>
+      <w:pPr>
+        <w:pStyle w:val="Heading2"/>
+        <w:keepNext w:val="0"/>
+        <w:keepLines w:val="0"/>
+        <w:spacing w:after="80"/>
         <w:rPr>
           <w:b/>
           <w:bCs/>
           <w:sz w:val="34"/>
           <w:szCs w:val="34"/>
         </w:rPr>
-        <w:t>6</w:t>
-      </w:r>
-      <w:r>
+      </w:pPr>
+    </w:p>
+    <w:p>
+      <w:pPr>
+        <w:pStyle w:val="Heading2"/>
+        <w:keepNext w:val="0"/>
+        <w:keepLines w:val="0"/>
+        <w:spacing w:after="80"/>
         <w:rPr>
           <w:b/>
           <w:bCs/>
           <w:sz w:val="34"/>
           <w:szCs w:val="34"/>
         </w:rPr>
-        <w:t>:</w:t>
+      </w:pPr>
+    </w:p>
+    <w:p>
+      <w:pPr>
+        <w:pStyle w:val="Heading2"/>
+        <w:keepNext w:val="0"/>
+        <w:keepLines w:val="0"/>
+        <w:spacing w:after="80"/>
+        <w:rPr>
+          <w:b/>
+          <w:bCs/>
+          <w:sz w:val="34"/>
+          <w:szCs w:val="34"/>
+        </w:rPr>
+      </w:pPr>
+    </w:p>
+    <w:p>
+      <w:pPr>
+        <w:pStyle w:val="Heading2"/>
+        <w:keepNext w:val="0"/>
+        <w:keepLines w:val="0"/>
+        <w:spacing w:after="80"/>
+        <w:rPr>
+          <w:b/>
+          <w:bCs/>
+          <w:sz w:val="34"/>
+          <w:szCs w:val="34"/>
+        </w:rPr>
+      </w:pPr>
+      <w:r>
+        <w:rPr>
+          <w:b/>
+          <w:bCs/>
+          <w:sz w:val="34"/>
+          <w:szCs w:val="34"/>
+        </w:rPr>
+        <w:t>Task 4:</w:t>
+      </w:r>
+    </w:p>
+    <w:p>
+      <w:pPr>
+        <w:jc w:val="center"/>
+      </w:pPr>
+      <w:r>
+        <w:lastRenderedPageBreak/>
+        <w:drawing>
+          <wp:inline distT="0" distB="0" distL="0" distR="0" wp14:anchorId="2B49CF7B" wp14:editId="01063878">
+            <wp:extent cx="3451463" cy="7567888"/>
+            <wp:effectExtent l="0" t="0" r="0" b="0"/>
+            <wp:docPr id="111869319" name="Picture 1"/>
+            <wp:cNvGraphicFramePr>
+              <a:graphicFrameLocks xmlns:a="http://schemas.openxmlformats.org/drawingml/2006/main" noChangeAspect="1"/>
+            </wp:cNvGraphicFramePr>
+            <a:graphic xmlns:a="http://schemas.openxmlformats.org/drawingml/2006/main">
+              <a:graphicData uri="http://schemas.openxmlformats.org/drawingml/2006/picture">
+                <pic:pic xmlns:pic="http://schemas.openxmlformats.org/drawingml/2006/picture">
+                  <pic:nvPicPr>
+                    <pic:cNvPr id="111869319" name=""/>
+                    <pic:cNvPicPr/>
+                  </pic:nvPicPr>
+                  <pic:blipFill>
+                    <a:blip r:embed="rId15"/>
+                    <a:stretch>
+                      <a:fillRect/>
+                    </a:stretch>
+                  </pic:blipFill>
+                  <pic:spPr>
+                    <a:xfrm>
+                      <a:off x="0" y="0"/>
+                      <a:ext cx="3477215" cy="7624352"/>
+                    </a:xfrm>
+                    <a:prstGeom prst="rect">
+                      <a:avLst/>
+                    </a:prstGeom>
+                  </pic:spPr>
+                </pic:pic>
+              </a:graphicData>
+            </a:graphic>
+          </wp:inline>
+        </w:drawing>
+      </w:r>
+    </w:p>
+    <w:p>
+      <w:pPr>
+        <w:pStyle w:val="Heading2"/>
+        <w:keepNext w:val="0"/>
+        <w:keepLines w:val="0"/>
+        <w:spacing w:after="80"/>
+        <w:rPr>
+          <w:sz w:val="34"/>
+          <w:szCs w:val="34"/>
+        </w:rPr>
+      </w:pPr>
+      <w:r>
+        <w:rPr>
+          <w:sz w:val="34"/>
+          <w:szCs w:val="34"/>
+        </w:rPr>
+        <w:lastRenderedPageBreak/>
+        <w:t>Explanation:</w:t>
+      </w:r>
+    </w:p>
+    <w:p>
+      <w:pPr>
+        <w:rPr>
+          <w:lang w:val="en-PK"/>
+        </w:rPr>
+      </w:pPr>
+      <w:r>
+        <w:rPr>
+          <w:lang w:val="en-PK"/>
+        </w:rPr>
+        <w:t xml:space="preserve">Create a dynamic marks table for students and subjects and find the student with the highest total. </w:t>
+      </w:r>
+      <w:r>
+        <w:rPr>
+          <w:lang w:val="en-PK"/>
+        </w:rPr>
+        <w:br/>
+      </w:r>
+    </w:p>
+    <w:p>
+      <w:r>
+        <w:rPr>
+          <w:lang w:val="en-PK"/>
+        </w:rPr>
+        <w:t>marks points to the row pointers, while marks[0] points to the first row. Every allocated row must be deleted to prevent memory leaks.</w:t>
+      </w:r>
+    </w:p>
+    <w:p>
+      <w:pPr>
+        <w:pStyle w:val="Heading2"/>
+        <w:keepNext w:val="0"/>
+        <w:keepLines w:val="0"/>
+        <w:spacing w:after="80"/>
+        <w:rPr>
+          <w:sz w:val="34"/>
+          <w:szCs w:val="34"/>
+        </w:rPr>
+      </w:pPr>
+      <w:r>
+        <w:rPr>
+          <w:b/>
+          <w:bCs/>
+          <w:sz w:val="34"/>
+          <w:szCs w:val="34"/>
+        </w:rPr>
+        <w:br/>
+      </w:r>
+      <w:r>
+        <w:rPr>
+          <w:sz w:val="34"/>
+          <w:szCs w:val="34"/>
+        </w:rPr>
+        <w:t xml:space="preserve">Output: </w:t>
+      </w:r>
+    </w:p>
+    <w:p>
+      <w:pPr>
+        <w:jc w:val="center"/>
+      </w:pPr>
+      <w:r>
+        <w:drawing>
+          <wp:inline distT="0" distB="0" distL="0" distR="0" wp14:anchorId="0471A2AA" wp14:editId="1679F52E">
+            <wp:extent cx="3086259" cy="2324219"/>
+            <wp:effectExtent l="0" t="0" r="0" b="0"/>
+            <wp:docPr id="523386936" name="Picture 1"/>
+            <wp:cNvGraphicFramePr>
+              <a:graphicFrameLocks xmlns:a="http://schemas.openxmlformats.org/drawingml/2006/main" noChangeAspect="1"/>
+            </wp:cNvGraphicFramePr>
+            <a:graphic xmlns:a="http://schemas.openxmlformats.org/drawingml/2006/main">
+              <a:graphicData uri="http://schemas.openxmlformats.org/drawingml/2006/picture">
+                <pic:pic xmlns:pic="http://schemas.openxmlformats.org/drawingml/2006/picture">
+                  <pic:nvPicPr>
+                    <pic:cNvPr id="523386936" name=""/>
+                    <pic:cNvPicPr/>
+                  </pic:nvPicPr>
+                  <pic:blipFill>
+                    <a:blip r:embed="rId16"/>
+                    <a:stretch>
+                      <a:fillRect/>
+                    </a:stretch>
+                  </pic:blipFill>
+                  <pic:spPr>
+                    <a:xfrm>
+                      <a:off x="0" y="0"/>
+                      <a:ext cx="3086259" cy="2324219"/>
+                    </a:xfrm>
+                    <a:prstGeom prst="rect">
+                      <a:avLst/>
+                    </a:prstGeom>
+                  </pic:spPr>
+                </pic:pic>
+              </a:graphicData>
+            </a:graphic>
+          </wp:inline>
+        </w:drawing>
+      </w:r>
+    </w:p>
+    <w:p>
+      <w:pPr>
+        <w:jc w:val="center"/>
+      </w:pPr>
+    </w:p>
+    <w:p>
+      <w:pPr>
+        <w:jc w:val="center"/>
+      </w:pPr>
+      <w:r>
+        <w:drawing>
+          <wp:inline distT="0" distB="0" distL="0" distR="0" wp14:anchorId="44E22552" wp14:editId="32BE844B">
+            <wp:extent cx="4076910" cy="2006703"/>
+            <wp:effectExtent l="0" t="0" r="0" b="0"/>
+            <wp:docPr id="2007956235" name="Picture 1"/>
+            <wp:cNvGraphicFramePr>
+              <a:graphicFrameLocks xmlns:a="http://schemas.openxmlformats.org/drawingml/2006/main" noChangeAspect="1"/>
+            </wp:cNvGraphicFramePr>
+            <a:graphic xmlns:a="http://schemas.openxmlformats.org/drawingml/2006/main">
+              <a:graphicData uri="http://schemas.openxmlformats.org/drawingml/2006/picture">
+                <pic:pic xmlns:pic="http://schemas.openxmlformats.org/drawingml/2006/picture">
+                  <pic:nvPicPr>
+                    <pic:cNvPr id="2007956235" name=""/>
+                    <pic:cNvPicPr/>
+                  </pic:nvPicPr>
+                  <pic:blipFill>
+                    <a:blip r:embed="rId17"/>
+                    <a:stretch>
+                      <a:fillRect/>
+                    </a:stretch>
+                  </pic:blipFill>
+                  <pic:spPr>
+                    <a:xfrm>
+                      <a:off x="0" y="0"/>
+                      <a:ext cx="4076910" cy="2006703"/>
+                    </a:xfrm>
+                    <a:prstGeom prst="rect">
+                      <a:avLst/>
+                    </a:prstGeom>
+                  </pic:spPr>
+                </pic:pic>
+              </a:graphicData>
+            </a:graphic>
+          </wp:inline>
+        </w:drawing>
+      </w:r>
+    </w:p>
+    <w:p>
+      <w:pPr>
+        <w:jc w:val="center"/>
+        <w:rPr>
+          <w:sz w:val="24"/>
+          <w:szCs w:val="24"/>
+        </w:rPr>
+      </w:pPr>
+      <w:r>
+        <w:pict w14:anchorId="171BF34E">
+          <v:rect id="_x0000_i1031" style="width:0;height:1.5pt" o:hralign="center" o:hrstd="t" o:hr="t" fillcolor="#a0a0a0" stroked="f"/>
+        </w:pict>
+      </w:r>
+    </w:p>
+    <w:p>
+      <w:pPr>
+        <w:spacing w:before="240" w:after="240"/>
+      </w:pPr>
+    </w:p>
+    <w:p>
+      <w:pPr>
+        <w:pStyle w:val="Heading2"/>
+        <w:keepNext w:val="0"/>
+        <w:keepLines w:val="0"/>
+        <w:spacing w:after="80"/>
+        <w:rPr>
+          <w:b/>
+          <w:bCs/>
+          <w:sz w:val="34"/>
+          <w:szCs w:val="34"/>
+        </w:rPr>
+      </w:pPr>
+    </w:p>
+    <w:p>
+      <w:pPr>
+        <w:pStyle w:val="Heading2"/>
+        <w:keepNext w:val="0"/>
+        <w:keepLines w:val="0"/>
+        <w:spacing w:after="80"/>
+      </w:pPr>
+      <w:r>
+        <w:rPr>
+          <w:b/>
+          <w:bCs/>
+          <w:sz w:val="34"/>
+          <w:szCs w:val="34"/>
+        </w:rPr>
+        <w:lastRenderedPageBreak/>
+        <w:t>Task 5:</w:t>
       </w:r>
     </w:p>
     <w:p>
       <w:pPr>
         <w:spacing w:before="240" w:after="240"/>
         <w:ind w:left="720"/>
-        <w:rPr>
-          <w:b/>
-          <w:bCs/>
-        </w:rPr>
-      </w:pPr>
-      <w:r>
-        <w:rPr>
-          <w:b/>
-          <w:bCs/>
+        <w:jc w:val="center"/>
+        <w:rPr>
+          <w:b/>
+          <w:bCs/>
+        </w:rPr>
+      </w:pPr>
+      <w:r>
+        <w:rPr>
+          <w:b/>
+          <w:bCs/>
+        </w:rPr>
+        <w:drawing>
+          <wp:inline distT="0" distB="0" distL="0" distR="0" wp14:anchorId="4B29AB26" wp14:editId="3AFEB952">
+            <wp:extent cx="3632764" cy="7505480"/>
+            <wp:effectExtent l="0" t="0" r="6350" b="635"/>
+            <wp:docPr id="688297339" name="Picture 1"/>
+            <wp:cNvGraphicFramePr>
+              <a:graphicFrameLocks xmlns:a="http://schemas.openxmlformats.org/drawingml/2006/main" noChangeAspect="1"/>
+            </wp:cNvGraphicFramePr>
+            <a:graphic xmlns:a="http://schemas.openxmlformats.org/drawingml/2006/main">
+              <a:graphicData uri="http://schemas.openxmlformats.org/drawingml/2006/picture">
+                <pic:pic xmlns:pic="http://schemas.openxmlformats.org/drawingml/2006/picture">
+                  <pic:nvPicPr>
+                    <pic:cNvPr id="688297339" name=""/>
+                    <pic:cNvPicPr/>
+                  </pic:nvPicPr>
+                  <pic:blipFill>
+                    <a:blip r:embed="rId18"/>
+                    <a:stretch>
+                      <a:fillRect/>
+                    </a:stretch>
+                  </pic:blipFill>
+                  <pic:spPr>
+                    <a:xfrm>
+                      <a:off x="0" y="0"/>
+                      <a:ext cx="3647507" cy="7535940"/>
+                    </a:xfrm>
+                    <a:prstGeom prst="rect">
+                      <a:avLst/>
+                    </a:prstGeom>
+                  </pic:spPr>
+                </pic:pic>
+              </a:graphicData>
+            </a:graphic>
+          </wp:inline>
+        </w:drawing>
+      </w:r>
+    </w:p>
+    <w:p>
+      <w:pPr>
+        <w:spacing w:before="240" w:after="240"/>
+        <w:ind w:left="720"/>
+        <w:rPr>
+          <w:b/>
+          <w:bCs/>
+        </w:rPr>
+      </w:pPr>
+      <w:r>
+        <w:rPr>
+          <w:b/>
+          <w:bCs/>
+        </w:rPr>
+        <w:lastRenderedPageBreak/>
+        <w:t>Outputs:</w:t>
+      </w:r>
+    </w:p>
+    <w:p>
+      <w:pPr>
+        <w:spacing w:before="240" w:after="240"/>
+        <w:ind w:left="720"/>
+        <w:jc w:val="center"/>
+        <w:rPr>
+          <w:b/>
+          <w:bCs/>
+        </w:rPr>
+      </w:pPr>
+      <w:r>
+        <w:rPr>
+          <w:b/>
+          <w:bCs/>
+        </w:rPr>
+        <w:drawing>
+          <wp:inline distT="0" distB="0" distL="0" distR="0" wp14:anchorId="23DC9697" wp14:editId="6089E9A2">
+            <wp:extent cx="2178162" cy="1073205"/>
+            <wp:effectExtent l="0" t="0" r="0" b="0"/>
+            <wp:docPr id="1019425514" name="Picture 1"/>
+            <wp:cNvGraphicFramePr>
+              <a:graphicFrameLocks xmlns:a="http://schemas.openxmlformats.org/drawingml/2006/main" noChangeAspect="1"/>
+            </wp:cNvGraphicFramePr>
+            <a:graphic xmlns:a="http://schemas.openxmlformats.org/drawingml/2006/main">
+              <a:graphicData uri="http://schemas.openxmlformats.org/drawingml/2006/picture">
+                <pic:pic xmlns:pic="http://schemas.openxmlformats.org/drawingml/2006/picture">
+                  <pic:nvPicPr>
+                    <pic:cNvPr id="1019425514" name=""/>
+                    <pic:cNvPicPr/>
+                  </pic:nvPicPr>
+                  <pic:blipFill>
+                    <a:blip r:embed="rId19"/>
+                    <a:stretch>
+                      <a:fillRect/>
+                    </a:stretch>
+                  </pic:blipFill>
+                  <pic:spPr>
+                    <a:xfrm>
+                      <a:off x="0" y="0"/>
+                      <a:ext cx="2178162" cy="1073205"/>
+                    </a:xfrm>
+                    <a:prstGeom prst="rect">
+                      <a:avLst/>
+                    </a:prstGeom>
+                  </pic:spPr>
+                </pic:pic>
+              </a:graphicData>
+            </a:graphic>
+          </wp:inline>
+        </w:drawing>
+      </w:r>
+    </w:p>
+    <w:p>
+      <w:pPr>
+        <w:spacing w:before="240" w:after="240"/>
+        <w:ind w:left="720"/>
+        <w:jc w:val="center"/>
+        <w:rPr>
+          <w:b/>
+          <w:bCs/>
+        </w:rPr>
+      </w:pPr>
+      <w:r>
+        <w:rPr>
+          <w:b/>
+          <w:bCs/>
+        </w:rPr>
+        <w:drawing>
+          <wp:inline distT="0" distB="0" distL="0" distR="0" wp14:anchorId="0B0B700C" wp14:editId="50D62678">
+            <wp:extent cx="2463927" cy="990651"/>
+            <wp:effectExtent l="0" t="0" r="0" b="0"/>
+            <wp:docPr id="130135221" name="Picture 1"/>
+            <wp:cNvGraphicFramePr>
+              <a:graphicFrameLocks xmlns:a="http://schemas.openxmlformats.org/drawingml/2006/main" noChangeAspect="1"/>
+            </wp:cNvGraphicFramePr>
+            <a:graphic xmlns:a="http://schemas.openxmlformats.org/drawingml/2006/main">
+              <a:graphicData uri="http://schemas.openxmlformats.org/drawingml/2006/picture">
+                <pic:pic xmlns:pic="http://schemas.openxmlformats.org/drawingml/2006/picture">
+                  <pic:nvPicPr>
+                    <pic:cNvPr id="130135221" name=""/>
+                    <pic:cNvPicPr/>
+                  </pic:nvPicPr>
+                  <pic:blipFill>
+                    <a:blip r:embed="rId20"/>
+                    <a:stretch>
+                      <a:fillRect/>
+                    </a:stretch>
+                  </pic:blipFill>
+                  <pic:spPr>
+                    <a:xfrm>
+                      <a:off x="0" y="0"/>
+                      <a:ext cx="2463927" cy="990651"/>
+                    </a:xfrm>
+                    <a:prstGeom prst="rect">
+                      <a:avLst/>
+                    </a:prstGeom>
+                  </pic:spPr>
+                </pic:pic>
+              </a:graphicData>
+            </a:graphic>
+          </wp:inline>
+        </w:drawing>
+      </w:r>
+    </w:p>
+    <w:p>
+      <w:pPr>
+        <w:spacing w:before="240" w:after="240"/>
+        <w:ind w:left="720"/>
+      </w:pPr>
+      <w:r>
+        <w:t>Explanation:</w:t>
+      </w:r>
+    </w:p>
+    <w:p>
+      <w:pPr>
+        <w:spacing w:before="240" w:after="240"/>
+        <w:ind w:left="720"/>
+        <w:rPr>
+          <w:lang w:val="en-PK"/>
+        </w:rPr>
+      </w:pPr>
+      <w:r>
+        <w:rPr>
+          <w:lang w:val="en-PK"/>
+        </w:rPr>
+        <w:t xml:space="preserve">Add one more mark by creating a bigger array and copying the old values into it. </w:t>
+      </w:r>
+    </w:p>
+    <w:p>
+      <w:pPr>
+        <w:spacing w:before="240" w:after="240"/>
+        <w:ind w:left="720"/>
+      </w:pPr>
+      <w:r>
+        <w:rPr>
+          <w:lang w:val="en-PK"/>
+        </w:rPr>
+        <w:t>Increasing n does not increase the old array's size. A new, bigger memory block is needed.</w:t>
+      </w:r>
+    </w:p>
+    <w:p>
+      <w:pPr>
+        <w:rPr>
           <w:sz w:val="24"/>
           <w:szCs w:val="24"/>
         </w:rPr>
-        <w:t>DELIVERABLES GO HERE (CODE/IMAGES/OUTPUT SCREENSHOTS etc.)</w:t>
-      </w:r>
+      </w:pPr>
+      <w:r>
+        <w:pict w14:anchorId="7592792F">
+          <v:rect id="_x0000_i1032" style="width:0;height:1.5pt" o:hralign="center" o:hrstd="t" o:hr="t" fillcolor="#a0a0a0" stroked="f"/>
+        </w:pict>
+      </w:r>
+    </w:p>
+    <w:p>
+      <w:pPr>
+        <w:spacing w:before="240" w:after="240"/>
+      </w:pPr>
+    </w:p>
+    <w:p>
+      <w:pPr>
+        <w:pStyle w:val="Heading2"/>
+        <w:keepNext w:val="0"/>
+        <w:keepLines w:val="0"/>
+        <w:spacing w:after="80"/>
+        <w:rPr>
+          <w:b/>
+          <w:bCs/>
+          <w:sz w:val="34"/>
+          <w:szCs w:val="34"/>
+        </w:rPr>
+      </w:pPr>
+    </w:p>
+    <w:p>
+      <w:pPr>
+        <w:pStyle w:val="Heading2"/>
+        <w:keepNext w:val="0"/>
+        <w:keepLines w:val="0"/>
+        <w:spacing w:after="80"/>
+        <w:rPr>
+          <w:b/>
+          <w:bCs/>
+          <w:sz w:val="34"/>
+          <w:szCs w:val="34"/>
+        </w:rPr>
+      </w:pPr>
+    </w:p>
+    <w:p>
+      <w:pPr>
+        <w:pStyle w:val="Heading2"/>
+        <w:keepNext w:val="0"/>
+        <w:keepLines w:val="0"/>
+        <w:spacing w:after="80"/>
+        <w:rPr>
+          <w:b/>
+          <w:bCs/>
+          <w:sz w:val="34"/>
+          <w:szCs w:val="34"/>
+        </w:rPr>
+      </w:pPr>
+    </w:p>
+    <w:p>
+      <w:pPr>
+        <w:pStyle w:val="Heading2"/>
+        <w:keepNext w:val="0"/>
+        <w:keepLines w:val="0"/>
+        <w:spacing w:after="80"/>
+        <w:rPr>
+          <w:b/>
+          <w:bCs/>
+          <w:sz w:val="34"/>
+          <w:szCs w:val="34"/>
+        </w:rPr>
+      </w:pPr>
+    </w:p>
+    <w:p>
+      <w:pPr>
+        <w:pStyle w:val="Heading2"/>
+        <w:keepNext w:val="0"/>
+        <w:keepLines w:val="0"/>
+        <w:spacing w:after="80"/>
+        <w:rPr>
+          <w:b/>
+          <w:bCs/>
+          <w:sz w:val="34"/>
+          <w:szCs w:val="34"/>
+        </w:rPr>
+      </w:pPr>
+    </w:p>
+    <w:p>
+      <w:pPr>
+        <w:pStyle w:val="Heading2"/>
+        <w:keepNext w:val="0"/>
+        <w:keepLines w:val="0"/>
+        <w:spacing w:after="80"/>
+        <w:rPr>
+          <w:b/>
+          <w:bCs/>
+          <w:sz w:val="34"/>
+          <w:szCs w:val="34"/>
+        </w:rPr>
+      </w:pPr>
+    </w:p>
+    <w:p>
+      <w:pPr>
+        <w:pStyle w:val="Heading2"/>
+        <w:keepNext w:val="0"/>
+        <w:keepLines w:val="0"/>
+        <w:spacing w:after="80"/>
+        <w:rPr>
+          <w:b/>
+          <w:bCs/>
+          <w:sz w:val="34"/>
+          <w:szCs w:val="34"/>
+        </w:rPr>
+      </w:pPr>
+    </w:p>
+    <w:p>
+      <w:pPr>
+        <w:pStyle w:val="Heading2"/>
+        <w:keepNext w:val="0"/>
+        <w:keepLines w:val="0"/>
+        <w:spacing w:after="80"/>
+        <w:rPr>
+          <w:b/>
+          <w:bCs/>
+          <w:sz w:val="34"/>
+          <w:szCs w:val="34"/>
+        </w:rPr>
+      </w:pPr>
+      <w:r>
+        <w:rPr>
+          <w:b/>
+          <w:bCs/>
+          <w:sz w:val="34"/>
+          <w:szCs w:val="34"/>
+        </w:rPr>
+        <w:lastRenderedPageBreak/>
+        <w:t>Task 6:</w:t>
+      </w:r>
+    </w:p>
+    <w:p>
+      <w:pPr>
+        <w:rPr>
+          <w:sz w:val="36"/>
+          <w:szCs w:val="36"/>
+        </w:rPr>
+      </w:pPr>
+      <w:r>
+        <w:rPr>
+          <w:sz w:val="36"/>
+          <w:szCs w:val="36"/>
+        </w:rPr>
+        <w:t>Errors:</w:t>
+      </w:r>
+    </w:p>
+    <w:p>
+      <w:pPr>
+        <w:pStyle w:val="ListParagraph"/>
+        <w:numPr>
+          <w:ilvl w:val="0"/>
+          <w:numId w:val="2"/>
+        </w:numPr>
+        <w:rPr>
+          <w:sz w:val="32"/>
+          <w:szCs w:val="32"/>
+        </w:rPr>
+      </w:pPr>
+      <w:r>
+        <w:rPr>
+          <w:sz w:val="32"/>
+          <w:szCs w:val="32"/>
+        </w:rPr>
+        <w:t>Out-of-bounds access</w:t>
+      </w:r>
+      <w:r>
+        <w:rPr>
+          <w:sz w:val="32"/>
+          <w:szCs w:val="32"/>
+        </w:rPr>
+        <w:t>:</w:t>
+      </w:r>
+    </w:p>
+    <w:p>
+      <w:pPr>
+        <w:rPr>
+          <w:sz w:val="28"/>
+          <w:szCs w:val="28"/>
+        </w:rPr>
+      </w:pPr>
+      <w:r>
+        <w:rPr>
+          <w:sz w:val="28"/>
+          <w:szCs w:val="28"/>
+        </w:rPr>
+        <w:t>“</w:t>
+      </w:r>
+      <w:r>
+        <w:rPr>
+          <w:sz w:val="26"/>
+          <w:szCs w:val="26"/>
+        </w:rPr>
+        <w:t>for (int i = 0; i &lt;= n; i++)</w:t>
+      </w:r>
+      <w:r>
+        <w:rPr>
+          <w:sz w:val="26"/>
+          <w:szCs w:val="26"/>
+        </w:rPr>
+        <w:t>”  should be like  “</w:t>
+      </w:r>
+      <w:r>
+        <w:rPr>
+          <w:sz w:val="26"/>
+          <w:szCs w:val="26"/>
+        </w:rPr>
+        <w:t>for (int i = 0; i &lt; n; i++)</w:t>
+      </w:r>
+      <w:r>
+        <w:rPr>
+          <w:sz w:val="26"/>
+          <w:szCs w:val="26"/>
+        </w:rPr>
+        <w:t>”</w:t>
+      </w:r>
+      <w:r>
+        <w:rPr>
+          <w:sz w:val="26"/>
+          <w:szCs w:val="26"/>
+        </w:rPr>
+        <w:br/>
+      </w:r>
+    </w:p>
+    <w:p>
+      <w:pPr>
+        <w:pStyle w:val="ListParagraph"/>
+        <w:numPr>
+          <w:ilvl w:val="0"/>
+          <w:numId w:val="2"/>
+        </w:numPr>
+        <w:rPr>
+          <w:sz w:val="32"/>
+          <w:szCs w:val="32"/>
+        </w:rPr>
+      </w:pPr>
+      <w:r>
+        <w:rPr>
+          <w:sz w:val="32"/>
+          <w:szCs w:val="32"/>
+        </w:rPr>
+        <w:t>Incorrect Deletion:</w:t>
+      </w:r>
+    </w:p>
+    <w:p>
+      <w:pPr>
+        <w:rPr>
+          <w:sz w:val="28"/>
+          <w:szCs w:val="28"/>
+        </w:rPr>
+      </w:pPr>
+      <w:r>
+        <w:rPr>
+          <w:sz w:val="28"/>
+          <w:szCs w:val="28"/>
+        </w:rPr>
+        <w:t>“</w:t>
+      </w:r>
+      <w:r>
+        <w:rPr>
+          <w:sz w:val="26"/>
+          <w:szCs w:val="26"/>
+        </w:rPr>
+        <w:t>delete values</w:t>
+      </w:r>
+      <w:r>
+        <w:rPr>
+          <w:sz w:val="26"/>
+          <w:szCs w:val="26"/>
+        </w:rPr>
+        <w:t>”   should be like  “</w:t>
+      </w:r>
+      <w:r>
+        <w:rPr>
+          <w:sz w:val="26"/>
+          <w:szCs w:val="26"/>
+        </w:rPr>
+        <w:t>delete[] values</w:t>
+      </w:r>
+      <w:r>
+        <w:rPr>
+          <w:sz w:val="26"/>
+          <w:szCs w:val="26"/>
+        </w:rPr>
+        <w:t>”</w:t>
+      </w:r>
+    </w:p>
+    <w:p>
+      <w:pPr>
+        <w:rPr>
+          <w:sz w:val="28"/>
+          <w:szCs w:val="28"/>
+        </w:rPr>
+      </w:pPr>
+    </w:p>
+    <w:p>
+      <w:pPr>
+        <w:pStyle w:val="ListParagraph"/>
+        <w:numPr>
+          <w:ilvl w:val="0"/>
+          <w:numId w:val="2"/>
+        </w:numPr>
+        <w:rPr>
+          <w:sz w:val="32"/>
+          <w:szCs w:val="32"/>
+        </w:rPr>
+      </w:pPr>
+      <w:r>
+        <w:rPr>
+          <w:sz w:val="32"/>
+          <w:szCs w:val="32"/>
+        </w:rPr>
+        <w:t>Using a dangling pointer</w:t>
+      </w:r>
+      <w:r>
+        <w:rPr>
+          <w:sz w:val="32"/>
+          <w:szCs w:val="32"/>
+        </w:rPr>
+        <w:t>:</w:t>
+      </w:r>
+    </w:p>
+    <w:p>
+      <w:pPr>
+        <w:rPr>
+          <w:sz w:val="26"/>
+          <w:szCs w:val="26"/>
+        </w:rPr>
+      </w:pPr>
+      <w:r>
+        <w:rPr>
+          <w:sz w:val="26"/>
+          <w:szCs w:val="26"/>
+        </w:rPr>
+        <w:t>“</w:t>
+      </w:r>
+      <w:r>
+        <w:rPr>
+          <w:sz w:val="26"/>
+          <w:szCs w:val="26"/>
+        </w:rPr>
+        <w:t>cout &lt;&lt; values[0];</w:t>
+      </w:r>
+      <w:r>
+        <w:rPr>
+          <w:sz w:val="26"/>
+          <w:szCs w:val="26"/>
+        </w:rPr>
+        <w:t>”</w:t>
+      </w:r>
+      <w:r>
+        <w:rPr>
+          <w:sz w:val="26"/>
+          <w:szCs w:val="26"/>
+        </w:rPr>
+        <w:t xml:space="preserve">  is wrong because values has already been released.</w:t>
+      </w:r>
+    </w:p>
+    <w:p>
+      <w:pPr>
+        <w:spacing w:before="240" w:after="240"/>
+        <w:ind w:left="720"/>
+        <w:jc w:val="center"/>
+        <w:rPr>
+          <w:b/>
+          <w:bCs/>
+        </w:rPr>
+      </w:pPr>
+      <w:r>
+        <w:rPr>
+          <w:b/>
+          <w:bCs/>
+        </w:rPr>
+        <w:drawing>
+          <wp:inline distT="0" distB="0" distL="0" distR="0" wp14:anchorId="2E1DCFC4" wp14:editId="48B860CD">
+            <wp:extent cx="5797848" cy="5029458"/>
+            <wp:effectExtent l="0" t="0" r="0" b="0"/>
+            <wp:docPr id="210632792" name="Picture 1"/>
+            <wp:cNvGraphicFramePr>
+              <a:graphicFrameLocks xmlns:a="http://schemas.openxmlformats.org/drawingml/2006/main" noChangeAspect="1"/>
+            </wp:cNvGraphicFramePr>
+            <a:graphic xmlns:a="http://schemas.openxmlformats.org/drawingml/2006/main">
+              <a:graphicData uri="http://schemas.openxmlformats.org/drawingml/2006/picture">
+                <pic:pic xmlns:pic="http://schemas.openxmlformats.org/drawingml/2006/picture">
+                  <pic:nvPicPr>
+                    <pic:cNvPr id="210632792" name=""/>
+                    <pic:cNvPicPr/>
+                  </pic:nvPicPr>
+                  <pic:blipFill>
+                    <a:blip r:embed="rId21"/>
+                    <a:stretch>
+                      <a:fillRect/>
+                    </a:stretch>
+                  </pic:blipFill>
+                  <pic:spPr>
+                    <a:xfrm>
+                      <a:off x="0" y="0"/>
+                      <a:ext cx="5797848" cy="5029458"/>
+                    </a:xfrm>
+                    <a:prstGeom prst="rect">
+                      <a:avLst/>
+                    </a:prstGeom>
+                  </pic:spPr>
+                </pic:pic>
+              </a:graphicData>
+            </a:graphic>
+          </wp:inline>
+        </w:drawing>
+      </w:r>
+    </w:p>
+    <w:p>
+      <w:pPr>
+        <w:spacing w:before="240" w:after="240"/>
+        <w:ind w:left="720"/>
+        <w:rPr>
+          <w:b/>
+          <w:bCs/>
+        </w:rPr>
+      </w:pPr>
+      <w:r>
+        <w:rPr>
+          <w:b/>
+          <w:bCs/>
+        </w:rPr>
+        <w:lastRenderedPageBreak/>
+        <w:t>Output:</w:t>
+      </w:r>
+    </w:p>
+    <w:p>
+      <w:pPr>
+        <w:spacing w:before="240" w:after="240"/>
+        <w:ind w:left="720"/>
+        <w:jc w:val="center"/>
+        <w:rPr>
+          <w:b/>
+          <w:bCs/>
+        </w:rPr>
+      </w:pPr>
+      <w:r>
+        <w:rPr>
+          <w:b/>
+          <w:bCs/>
+        </w:rPr>
+        <w:drawing>
+          <wp:inline distT="0" distB="0" distL="0" distR="0" wp14:anchorId="2ABD60BE" wp14:editId="3E352FB7">
+            <wp:extent cx="3714941" cy="476274"/>
+            <wp:effectExtent l="0" t="0" r="0" b="0"/>
+            <wp:docPr id="1508736774" name="Picture 1"/>
+            <wp:cNvGraphicFramePr>
+              <a:graphicFrameLocks xmlns:a="http://schemas.openxmlformats.org/drawingml/2006/main" noChangeAspect="1"/>
+            </wp:cNvGraphicFramePr>
+            <a:graphic xmlns:a="http://schemas.openxmlformats.org/drawingml/2006/main">
+              <a:graphicData uri="http://schemas.openxmlformats.org/drawingml/2006/picture">
+                <pic:pic xmlns:pic="http://schemas.openxmlformats.org/drawingml/2006/picture">
+                  <pic:nvPicPr>
+                    <pic:cNvPr id="1508736774" name=""/>
+                    <pic:cNvPicPr/>
+                  </pic:nvPicPr>
+                  <pic:blipFill>
+                    <a:blip r:embed="rId22"/>
+                    <a:stretch>
+                      <a:fillRect/>
+                    </a:stretch>
+                  </pic:blipFill>
+                  <pic:spPr>
+                    <a:xfrm>
+                      <a:off x="0" y="0"/>
+                      <a:ext cx="3714941" cy="476274"/>
+                    </a:xfrm>
+                    <a:prstGeom prst="rect">
+                      <a:avLst/>
+                    </a:prstGeom>
+                  </pic:spPr>
+                </pic:pic>
+              </a:graphicData>
+            </a:graphic>
+          </wp:inline>
+        </w:drawing>
+      </w:r>
+    </w:p>
+    <w:p>
+      <w:pPr>
+        <w:spacing w:before="240" w:after="240"/>
+        <w:ind w:left="720"/>
+        <w:jc w:val="center"/>
+        <w:rPr>
+          <w:b/>
+          <w:bCs/>
+        </w:rPr>
+      </w:pPr>
+      <w:r>
+        <w:rPr>
+          <w:b/>
+          <w:bCs/>
+        </w:rPr>
+        <w:drawing>
+          <wp:inline distT="0" distB="0" distL="0" distR="0" wp14:anchorId="1F88543A" wp14:editId="4C13ECF7">
+            <wp:extent cx="3835597" cy="425472"/>
+            <wp:effectExtent l="0" t="0" r="0" b="0"/>
+            <wp:docPr id="136170376" name="Picture 1"/>
+            <wp:cNvGraphicFramePr>
+              <a:graphicFrameLocks xmlns:a="http://schemas.openxmlformats.org/drawingml/2006/main" noChangeAspect="1"/>
+            </wp:cNvGraphicFramePr>
+            <a:graphic xmlns:a="http://schemas.openxmlformats.org/drawingml/2006/main">
+              <a:graphicData uri="http://schemas.openxmlformats.org/drawingml/2006/picture">
+                <pic:pic xmlns:pic="http://schemas.openxmlformats.org/drawingml/2006/picture">
+                  <pic:nvPicPr>
+                    <pic:cNvPr id="136170376" name=""/>
+                    <pic:cNvPicPr/>
+                  </pic:nvPicPr>
+                  <pic:blipFill>
+                    <a:blip r:embed="rId23"/>
+                    <a:stretch>
+                      <a:fillRect/>
+                    </a:stretch>
+                  </pic:blipFill>
+                  <pic:spPr>
+                    <a:xfrm>
+                      <a:off x="0" y="0"/>
+                      <a:ext cx="3835597" cy="425472"/>
+                    </a:xfrm>
+                    <a:prstGeom prst="rect">
+                      <a:avLst/>
+                    </a:prstGeom>
+                  </pic:spPr>
+                </pic:pic>
+              </a:graphicData>
+            </a:graphic>
+          </wp:inline>
+        </w:drawing>
+      </w:r>
+    </w:p>
+    <w:p>
+      <w:pPr>
+        <w:spacing w:before="240" w:after="240"/>
+        <w:ind w:left="720"/>
+        <w:rPr>
+          <w:b/>
+          <w:bCs/>
+        </w:rPr>
+      </w:pPr>
+      <w:r>
+        <w:rPr>
+          <w:b/>
+          <w:bCs/>
+        </w:rPr>
+        <w:t>E</w:t>
+      </w:r>
+      <w:r>
+        <w:rPr>
+          <w:b/>
+          <w:bCs/>
+        </w:rPr>
+        <w:t>xplanation:</w:t>
+      </w:r>
+    </w:p>
+    <w:p>
+      <w:pPr>
+        <w:spacing w:before="240" w:after="240"/>
+        <w:ind w:left="720"/>
+        <w:rPr>
+          <w:lang w:val="en-PK"/>
+        </w:rPr>
+      </w:pPr>
+      <w:r>
+        <w:rPr>
+          <w:lang w:val="en-PK"/>
+        </w:rPr>
+        <w:t xml:space="preserve">Find and fix errors related to array limits, deleting memory, and pointers. </w:t>
+      </w:r>
+    </w:p>
+    <w:p>
+      <w:pPr>
+        <w:spacing w:before="240" w:after="240"/>
+        <w:ind w:left="720"/>
+        <w:rPr>
+          <w:b/>
+          <w:bCs/>
+          <w:lang w:val="en-PK"/>
+        </w:rPr>
+      </w:pPr>
+      <w:r>
+        <w:rPr>
+          <w:lang w:val="en-PK"/>
+        </w:rPr>
+        <w:t>Out-of-bounds means accessing outside the array, a dangling pointer points to deleted memory, and a memory leak means allocated memory was never released</w:t>
+      </w:r>
+      <w:r>
+        <w:rPr>
+          <w:b/>
+          <w:bCs/>
+          <w:lang w:val="en-PK"/>
+        </w:rPr>
+        <w:t xml:space="preserve">. </w:t>
+      </w:r>
+    </w:p>
+    <w:p>
+      <w:pPr>
+        <w:spacing w:before="240" w:after="240"/>
+        <w:ind w:left="720"/>
+        <w:rPr>
+          <w:b/>
+          <w:bCs/>
+        </w:rPr>
+      </w:pPr>
     </w:p>
     <w:p>
       <w:pPr>
@@ -1403,9 +2482,8 @@
         </w:rPr>
       </w:pPr>
       <w:r>
-        <w:lastRenderedPageBreak/>
         <w:pict w14:anchorId="5F8C425D">
-          <v:rect id="_x0000_i1035" style="width:0;height:1.5pt" o:hralign="center" o:hrstd="t" o:hr="t" fillcolor="#a0a0a0" stroked="f"/>
+          <v:rect id="_x0000_i1033" style="width:0;height:1.5pt" o:hralign="center" o:hrstd="t" o:hr="t" fillcolor="#a0a0a0" stroked="f"/>
         </w:pict>
       </w:r>
     </w:p>
@@ -1416,8 +2494,8 @@
     </w:p>
     <w:p/>
     <w:sectPr>
-      <w:headerReference w:type="default" r:id="rId14"/>
-      <w:footerReference w:type="default" r:id="rId15"/>
+      <w:headerReference w:type="default" r:id="rId24"/>
+      <w:footerReference w:type="default" r:id="rId25"/>
       <w:pgSz w:w="12240" w:h="15840"/>
       <w:pgMar w:top="720" w:right="720" w:bottom="720" w:left="720" w:header="720" w:footer="720" w:gutter="0"/>
       <w:pgNumType w:start="1"/>
@@ -1551,6 +2629,347 @@
     </w:r>
   </w:p>
 </w:hdr>
+</file>
+
+<file path=word/numbering.xml><?xml version="1.0" encoding="utf-8"?>
+<w:numbering xmlns:wpc="http://schemas.microsoft.com/office/word/2010/wordprocessingCanvas" xmlns:cx="http://schemas.microsoft.com/office/drawing/2014/chartex" xmlns:cx1="http://schemas.microsoft.com/office/drawing/2015/9/8/chartex" xmlns:cx2="http://schemas.microsoft.com/office/drawing/2015/10/21/chartex" xmlns:cx3="http://schemas.microsoft.com/office/drawing/2016/5/9/chartex" xmlns:cx4="http://schemas.microsoft.com/office/drawing/2016/5/10/chartex" xmlns:cx5="http://schemas.microsoft.com/office/drawing/2016/5/11/chartex" xmlns:cx6="http://schemas.microsoft.com/office/drawing/2016/5/12/chartex" xmlns:cx7="http://schemas.microsoft.com/office/drawing/2016/5/13/chartex" xmlns:cx8="http://schemas.microsoft.com/office/drawing/2016/5/14/chartex" xmlns:mc="http://schemas.openxmlformats.org/markup-compatibility/2006" xmlns:aink="http://schemas.microsoft.com/office/drawing/2016/ink" xmlns:am3d="http://schemas.microsoft.com/office/drawing/2017/model3d" xmlns:o="urn:schemas-microsoft-com:office:office" xmlns:oel="http://schemas.microsoft.com/office/2019/extlst" xmlns:r="http://schemas.openxmlformats.org/officeDocument/2006/relationships" xmlns:m="http://schemas.openxmlformats.org/officeDocument/2006/math" xmlns:v="urn:schemas-microsoft-com:vml" xmlns:wp14="http://schemas.microsoft.com/office/word/2010/wordprocessingDrawing" xmlns:wp="http://schemas.openxmlformats.org/drawingml/2006/wordprocessingDrawing" xmlns:w10="urn:schemas-microsoft-com:office:word" xmlns:w="http://schemas.openxmlformats.org/wordprocessingml/2006/main" xmlns:w14="http://schemas.microsoft.com/office/word/2010/wordml" xmlns:w15="http://schemas.microsoft.com/office/word/2012/wordml" xmlns:w16cex="http://schemas.microsoft.com/office/word/2018/wordml/cex" xmlns:w16cid="http://schemas.microsoft.com/office/word/2016/wordml/cid" xmlns:w16="http://schemas.microsoft.com/office/word/2018/wordml" xmlns:w16du="http://schemas.microsoft.com/office/word/2023/wordml/word16du" xmlns:w16sdtdh="http://schemas.microsoft.com/office/word/2020/wordml/sdtdatahash" xmlns:w16sdtfl="http://schemas.microsoft.com/office/word/2024/wordml/sdtformatlock" xmlns:w16se="http://schemas.microsoft.com/office/word/2015/wordml/symex" xmlns:wpg="http://schemas.microsoft.com/office/word/2010/wordprocessingGroup" xmlns:wpi="http://schemas.microsoft.com/office/word/2010/wordprocessingInk" xmlns:wne="http://schemas.microsoft.com/office/word/2006/wordml" xmlns:wps="http://schemas.microsoft.com/office/word/2010/wordprocessingShape" mc:Ignorable="w14 w15 w16se w16cid w16 w16cex w16sdtdh w16sdtfl w16du wp14">
+  <w:abstractNum w:abstractNumId="0" w15:restartNumberingAfterBreak="0">
+    <w:nsid w:val="114D75E8"/>
+    <w:multiLevelType w:val="hybridMultilevel"/>
+    <w:tmpl w:val="E5D23378"/>
+    <w:lvl w:ilvl="0" w:tplc="2000000F">
+      <w:start w:val="1"/>
+      <w:numFmt w:val="decimal"/>
+      <w:lvlText w:val="%1."/>
+      <w:lvlJc w:val="left"/>
+      <w:pPr>
+        <w:ind w:left="720" w:hanging="360"/>
+      </w:pPr>
+      <w:rPr>
+        <w:rFonts w:hint="default"/>
+      </w:rPr>
+    </w:lvl>
+    <w:lvl w:ilvl="1" w:tplc="20000019" w:tentative="1">
+      <w:start w:val="1"/>
+      <w:numFmt w:val="lowerLetter"/>
+      <w:lvlText w:val="%2."/>
+      <w:lvlJc w:val="left"/>
+      <w:pPr>
+        <w:ind w:left="1440" w:hanging="360"/>
+      </w:pPr>
+    </w:lvl>
+    <w:lvl w:ilvl="2" w:tplc="2000001B" w:tentative="1">
+      <w:start w:val="1"/>
+      <w:numFmt w:val="lowerRoman"/>
+      <w:lvlText w:val="%3."/>
+      <w:lvlJc w:val="right"/>
+      <w:pPr>
+        <w:ind w:left="2160" w:hanging="180"/>
+      </w:pPr>
+    </w:lvl>
+    <w:lvl w:ilvl="3" w:tplc="2000000F" w:tentative="1">
+      <w:start w:val="1"/>
+      <w:numFmt w:val="decimal"/>
+      <w:lvlText w:val="%4."/>
+      <w:lvlJc w:val="left"/>
+      <w:pPr>
+        <w:ind w:left="2880" w:hanging="360"/>
+      </w:pPr>
+    </w:lvl>
+    <w:lvl w:ilvl="4" w:tplc="20000019" w:tentative="1">
+      <w:start w:val="1"/>
+      <w:numFmt w:val="lowerLetter"/>
+      <w:lvlText w:val="%5."/>
+      <w:lvlJc w:val="left"/>
+      <w:pPr>
+        <w:ind w:left="3600" w:hanging="360"/>
+      </w:pPr>
+    </w:lvl>
+    <w:lvl w:ilvl="5" w:tplc="2000001B" w:tentative="1">
+      <w:start w:val="1"/>
+      <w:numFmt w:val="lowerRoman"/>
+      <w:lvlText w:val="%6."/>
+      <w:lvlJc w:val="right"/>
+      <w:pPr>
+        <w:ind w:left="4320" w:hanging="180"/>
+      </w:pPr>
+    </w:lvl>
+    <w:lvl w:ilvl="6" w:tplc="2000000F" w:tentative="1">
+      <w:start w:val="1"/>
+      <w:numFmt w:val="decimal"/>
+      <w:lvlText w:val="%7."/>
+      <w:lvlJc w:val="left"/>
+      <w:pPr>
+        <w:ind w:left="5040" w:hanging="360"/>
+      </w:pPr>
+    </w:lvl>
+    <w:lvl w:ilvl="7" w:tplc="20000019" w:tentative="1">
+      <w:start w:val="1"/>
+      <w:numFmt w:val="lowerLetter"/>
+      <w:lvlText w:val="%8."/>
+      <w:lvlJc w:val="left"/>
+      <w:pPr>
+        <w:ind w:left="5760" w:hanging="360"/>
+      </w:pPr>
+    </w:lvl>
+    <w:lvl w:ilvl="8" w:tplc="2000001B" w:tentative="1">
+      <w:start w:val="1"/>
+      <w:numFmt w:val="lowerRoman"/>
+      <w:lvlText w:val="%9."/>
+      <w:lvlJc w:val="right"/>
+      <w:pPr>
+        <w:ind w:left="6480" w:hanging="180"/>
+      </w:pPr>
+    </w:lvl>
+  </w:abstractNum>
+  <w:abstractNum w:abstractNumId="1" w15:restartNumberingAfterBreak="0">
+    <w:nsid w:val="5F300BEE"/>
+    <w:multiLevelType w:val="multilevel"/>
+    <w:tmpl w:val="B4A261EE"/>
+    <w:lvl w:ilvl="0">
+      <w:start w:val="1"/>
+      <w:numFmt w:val="bullet"/>
+      <w:lvlText w:val=""/>
+      <w:lvlJc w:val="left"/>
+      <w:pPr>
+        <w:tabs>
+          <w:tab w:val="num" w:pos="720"/>
+        </w:tabs>
+        <w:ind w:left="720" w:hanging="360"/>
+      </w:pPr>
+      <w:rPr>
+        <w:rFonts w:ascii="Symbol" w:hAnsi="Symbol" w:hint="default"/>
+        <w:sz w:val="20"/>
+      </w:rPr>
+    </w:lvl>
+    <w:lvl w:ilvl="1" w:tentative="1">
+      <w:start w:val="1"/>
+      <w:numFmt w:val="bullet"/>
+      <w:lvlText w:val="o"/>
+      <w:lvlJc w:val="left"/>
+      <w:pPr>
+        <w:tabs>
+          <w:tab w:val="num" w:pos="1440"/>
+        </w:tabs>
+        <w:ind w:left="1440" w:hanging="360"/>
+      </w:pPr>
+      <w:rPr>
+        <w:rFonts w:ascii="Courier New" w:hAnsi="Courier New" w:hint="default"/>
+        <w:sz w:val="20"/>
+      </w:rPr>
+    </w:lvl>
+    <w:lvl w:ilvl="2" w:tentative="1">
+      <w:start w:val="1"/>
+      <w:numFmt w:val="bullet"/>
+      <w:lvlText w:val=""/>
+      <w:lvlJc w:val="left"/>
+      <w:pPr>
+        <w:tabs>
+          <w:tab w:val="num" w:pos="2160"/>
+        </w:tabs>
+        <w:ind w:left="2160" w:hanging="360"/>
+      </w:pPr>
+      <w:rPr>
+        <w:rFonts w:ascii="Wingdings" w:hAnsi="Wingdings" w:hint="default"/>
+        <w:sz w:val="20"/>
+      </w:rPr>
+    </w:lvl>
+    <w:lvl w:ilvl="3" w:tentative="1">
+      <w:start w:val="1"/>
+      <w:numFmt w:val="bullet"/>
+      <w:lvlText w:val=""/>
+      <w:lvlJc w:val="left"/>
+      <w:pPr>
+        <w:tabs>
+          <w:tab w:val="num" w:pos="2880"/>
+        </w:tabs>
+        <w:ind w:left="2880" w:hanging="360"/>
+      </w:pPr>
+      <w:rPr>
+        <w:rFonts w:ascii="Wingdings" w:hAnsi="Wingdings" w:hint="default"/>
+        <w:sz w:val="20"/>
+      </w:rPr>
+    </w:lvl>
+    <w:lvl w:ilvl="4" w:tentative="1">
+      <w:start w:val="1"/>
+      <w:numFmt w:val="bullet"/>
+      <w:lvlText w:val=""/>
+      <w:lvlJc w:val="left"/>
+      <w:pPr>
+        <w:tabs>
+          <w:tab w:val="num" w:pos="3600"/>
+        </w:tabs>
+        <w:ind w:left="3600" w:hanging="360"/>
+      </w:pPr>
+      <w:rPr>
+        <w:rFonts w:ascii="Wingdings" w:hAnsi="Wingdings" w:hint="default"/>
+        <w:sz w:val="20"/>
+      </w:rPr>
+    </w:lvl>
+    <w:lvl w:ilvl="5" w:tentative="1">
+      <w:start w:val="1"/>
+      <w:numFmt w:val="bullet"/>
+      <w:lvlText w:val=""/>
+      <w:lvlJc w:val="left"/>
+      <w:pPr>
+        <w:tabs>
+          <w:tab w:val="num" w:pos="4320"/>
+        </w:tabs>
+        <w:ind w:left="4320" w:hanging="360"/>
+      </w:pPr>
+      <w:rPr>
+        <w:rFonts w:ascii="Wingdings" w:hAnsi="Wingdings" w:hint="default"/>
+        <w:sz w:val="20"/>
+      </w:rPr>
+    </w:lvl>
+    <w:lvl w:ilvl="6" w:tentative="1">
+      <w:start w:val="1"/>
+      <w:numFmt w:val="bullet"/>
+      <w:lvlText w:val=""/>
+      <w:lvlJc w:val="left"/>
+      <w:pPr>
+        <w:tabs>
+          <w:tab w:val="num" w:pos="5040"/>
+        </w:tabs>
+        <w:ind w:left="5040" w:hanging="360"/>
+      </w:pPr>
+      <w:rPr>
+        <w:rFonts w:ascii="Wingdings" w:hAnsi="Wingdings" w:hint="default"/>
+        <w:sz w:val="20"/>
+      </w:rPr>
+    </w:lvl>
+    <w:lvl w:ilvl="7" w:tentative="1">
+      <w:start w:val="1"/>
+      <w:numFmt w:val="bullet"/>
+      <w:lvlText w:val=""/>
+      <w:lvlJc w:val="left"/>
+      <w:pPr>
+        <w:tabs>
+          <w:tab w:val="num" w:pos="5760"/>
+        </w:tabs>
+        <w:ind w:left="5760" w:hanging="360"/>
+      </w:pPr>
+      <w:rPr>
+        <w:rFonts w:ascii="Wingdings" w:hAnsi="Wingdings" w:hint="default"/>
+        <w:sz w:val="20"/>
+      </w:rPr>
+    </w:lvl>
+    <w:lvl w:ilvl="8" w:tentative="1">
+      <w:start w:val="1"/>
+      <w:numFmt w:val="bullet"/>
+      <w:lvlText w:val=""/>
+      <w:lvlJc w:val="left"/>
+      <w:pPr>
+        <w:tabs>
+          <w:tab w:val="num" w:pos="6480"/>
+        </w:tabs>
+        <w:ind w:left="6480" w:hanging="360"/>
+      </w:pPr>
+      <w:rPr>
+        <w:rFonts w:ascii="Wingdings" w:hAnsi="Wingdings" w:hint="default"/>
+        <w:sz w:val="20"/>
+      </w:rPr>
+    </w:lvl>
+  </w:abstractNum>
+  <w:abstractNum w:abstractNumId="2" w15:restartNumberingAfterBreak="0">
+    <w:nsid w:val="68D800E2"/>
+    <w:multiLevelType w:val="hybridMultilevel"/>
+    <w:tmpl w:val="BB5AF8D0"/>
+    <w:lvl w:ilvl="0" w:tplc="7716F634">
+      <w:start w:val="1"/>
+      <w:numFmt w:val="decimal"/>
+      <w:lvlText w:val="%1."/>
+      <w:lvlJc w:val="left"/>
+      <w:pPr>
+        <w:ind w:left="1080" w:hanging="360"/>
+      </w:pPr>
+      <w:rPr>
+        <w:rFonts w:hint="default"/>
+      </w:rPr>
+    </w:lvl>
+    <w:lvl w:ilvl="1" w:tplc="20000019" w:tentative="1">
+      <w:start w:val="1"/>
+      <w:numFmt w:val="lowerLetter"/>
+      <w:lvlText w:val="%2."/>
+      <w:lvlJc w:val="left"/>
+      <w:pPr>
+        <w:ind w:left="1800" w:hanging="360"/>
+      </w:pPr>
+    </w:lvl>
+    <w:lvl w:ilvl="2" w:tplc="2000001B" w:tentative="1">
+      <w:start w:val="1"/>
+      <w:numFmt w:val="lowerRoman"/>
+      <w:lvlText w:val="%3."/>
+      <w:lvlJc w:val="right"/>
+      <w:pPr>
+        <w:ind w:left="2520" w:hanging="180"/>
+      </w:pPr>
+    </w:lvl>
+    <w:lvl w:ilvl="3" w:tplc="2000000F" w:tentative="1">
+      <w:start w:val="1"/>
+      <w:numFmt w:val="decimal"/>
+      <w:lvlText w:val="%4."/>
+      <w:lvlJc w:val="left"/>
+      <w:pPr>
+        <w:ind w:left="3240" w:hanging="360"/>
+      </w:pPr>
+    </w:lvl>
+    <w:lvl w:ilvl="4" w:tplc="20000019" w:tentative="1">
+      <w:start w:val="1"/>
+      <w:numFmt w:val="lowerLetter"/>
+      <w:lvlText w:val="%5."/>
+      <w:lvlJc w:val="left"/>
+      <w:pPr>
+        <w:ind w:left="3960" w:hanging="360"/>
+      </w:pPr>
+    </w:lvl>
+    <w:lvl w:ilvl="5" w:tplc="2000001B" w:tentative="1">
+      <w:start w:val="1"/>
+      <w:numFmt w:val="lowerRoman"/>
+      <w:lvlText w:val="%6."/>
+      <w:lvlJc w:val="right"/>
+      <w:pPr>
+        <w:ind w:left="4680" w:hanging="180"/>
+      </w:pPr>
+    </w:lvl>
+    <w:lvl w:ilvl="6" w:tplc="2000000F" w:tentative="1">
+      <w:start w:val="1"/>
+      <w:numFmt w:val="decimal"/>
+      <w:lvlText w:val="%7."/>
+      <w:lvlJc w:val="left"/>
+      <w:pPr>
+        <w:ind w:left="5400" w:hanging="360"/>
+      </w:pPr>
+    </w:lvl>
+    <w:lvl w:ilvl="7" w:tplc="20000019" w:tentative="1">
+      <w:start w:val="1"/>
+      <w:numFmt w:val="lowerLetter"/>
+      <w:lvlText w:val="%8."/>
+      <w:lvlJc w:val="left"/>
+      <w:pPr>
+        <w:ind w:left="6120" w:hanging="360"/>
+      </w:pPr>
+    </w:lvl>
+    <w:lvl w:ilvl="8" w:tplc="2000001B" w:tentative="1">
+      <w:start w:val="1"/>
+      <w:numFmt w:val="lowerRoman"/>
+      <w:lvlText w:val="%9."/>
+      <w:lvlJc w:val="right"/>
+      <w:pPr>
+        <w:ind w:left="6840" w:hanging="180"/>
+      </w:pPr>
+    </w:lvl>
+  </w:abstractNum>
+  <w:num w:numId="1" w16cid:durableId="2078747711">
+    <w:abstractNumId w:val="2"/>
+  </w:num>
+  <w:num w:numId="2" w16cid:durableId="2052339801">
+    <w:abstractNumId w:val="0"/>
+  </w:num>
+  <w:num w:numId="3" w16cid:durableId="702023505">
+    <w:abstractNumId w:val="1"/>
+  </w:num>
+</w:numbering>
 </file>
 
 <file path=word/styles.xml><?xml version="1.0" encoding="utf-8"?>
@@ -2135,6 +3554,17 @@
       <w:szCs w:val="30"/>
     </w:rPr>
   </w:style>
+  <w:style w:type="paragraph" w:styleId="ListParagraph">
+    <w:name w:val="List Paragraph"/>
+    <w:basedOn w:val="Normal"/>
+    <w:uiPriority w:val="34"/>
+    <w:qFormat/>
+    <w:rsid w:val="00226DD5"/>
+    <w:pPr>
+      <w:ind w:left="720"/>
+      <w:contextualSpacing/>
+    </w:pPr>
+  </w:style>
 </w:styles>
 </file>
 

</xml_diff>

<commit_message>
Lab 03 task 1-6
</commit_message>
<xml_diff>
--- a/Labs/Lab 2/Lab 02 Doc.docx
+++ b/Labs/Lab 2/Lab 02 Doc.docx
@@ -269,6 +269,8 @@
           <w:szCs w:val="32"/>
         </w:rPr>
       </w:pPr>
+      <w:proofErr w:type="spellStart"/>
+      <w:proofErr w:type="gramStart"/>
       <w:r>
         <w:rPr>
           <w:b/>
@@ -276,7 +278,27 @@
           <w:sz w:val="32"/>
           <w:szCs w:val="32"/>
         </w:rPr>
-        <w:t>Lms  Id:</w:t>
+        <w:t>Lms</w:t>
+      </w:r>
+      <w:proofErr w:type="spellEnd"/>
+      <w:r>
+        <w:rPr>
+          <w:b/>
+          <w:bCs/>
+          <w:sz w:val="32"/>
+          <w:szCs w:val="32"/>
+        </w:rPr>
+        <w:t xml:space="preserve">  Id</w:t>
+      </w:r>
+      <w:proofErr w:type="gramEnd"/>
+      <w:r>
+        <w:rPr>
+          <w:b/>
+          <w:bCs/>
+          <w:sz w:val="32"/>
+          <w:szCs w:val="32"/>
+        </w:rPr>
+        <w:t>:</w:t>
       </w:r>
       <w:r>
         <w:rPr>
@@ -319,6 +341,49 @@
       </w:pPr>
       <w:bookmarkStart w:id="7" w:name="_7qj4tdzcn4er" w:colFirst="0" w:colLast="0"/>
       <w:bookmarkEnd w:id="7"/>
+      <w:proofErr w:type="spellStart"/>
+      <w:r>
+        <w:rPr>
+          <w:b/>
+          <w:bCs/>
+          <w:sz w:val="34"/>
+          <w:szCs w:val="34"/>
+        </w:rPr>
+        <w:t>Github</w:t>
+      </w:r>
+      <w:proofErr w:type="spellEnd"/>
+      <w:r>
+        <w:rPr>
+          <w:b/>
+          <w:bCs/>
+          <w:sz w:val="34"/>
+          <w:szCs w:val="34"/>
+        </w:rPr>
+        <w:t xml:space="preserve"> Repo Link:</w:t>
+      </w:r>
+    </w:p>
+    <w:p/>
+    <w:p>
+      <w:hyperlink r:id="rId7" w:history="1">
+        <w:r>
+          <w:rPr>
+            <w:rStyle w:val="Hyperlink"/>
+          </w:rPr>
+          <w:t>https://github.com/SolitaryRehman/DS</w:t>
+        </w:r>
+        <w:r>
+          <w:rPr>
+            <w:rStyle w:val="Hyperlink"/>
+          </w:rPr>
+          <w:t>A</w:t>
+        </w:r>
+        <w:r>
+          <w:rPr>
+            <w:rStyle w:val="Hyperlink"/>
+          </w:rPr>
+          <w:t>-Labs</w:t>
+        </w:r>
+      </w:hyperlink>
     </w:p>
     <w:p>
       <w:pPr>
@@ -489,13 +554,19 @@
         <w:spacing w:before="240" w:after="240"/>
         <w:ind w:left="720"/>
       </w:pPr>
+      <w:proofErr w:type="spellStart"/>
       <w:r>
         <w:t>Vscode</w:t>
       </w:r>
+      <w:proofErr w:type="spellEnd"/>
       <w:r>
         <w:br/>
+      </w:r>
+      <w:proofErr w:type="spellStart"/>
+      <w:r>
         <w:t>Github</w:t>
       </w:r>
+      <w:proofErr w:type="spellEnd"/>
     </w:p>
     <w:p>
       <w:r>
@@ -589,7 +660,6 @@
           <w:sz w:val="46"/>
           <w:szCs w:val="46"/>
         </w:rPr>
-        <w:lastRenderedPageBreak/>
         <w:t>Lab Tasks</w:t>
       </w:r>
     </w:p>
@@ -642,7 +712,7 @@
                     <pic:cNvPicPr/>
                   </pic:nvPicPr>
                   <pic:blipFill>
-                    <a:blip r:embed="rId7"/>
+                    <a:blip r:embed="rId8"/>
                     <a:stretch>
                       <a:fillRect/>
                     </a:stretch>
@@ -665,6 +735,7 @@
     </w:p>
     <w:p>
       <w:r>
+        <w:lastRenderedPageBreak/>
         <w:t>Explanation:</w:t>
       </w:r>
     </w:p>
@@ -716,7 +787,6 @@
     </w:p>
     <w:p>
       <w:r>
-        <w:lastRenderedPageBreak/>
         <w:t>Output:</w:t>
       </w:r>
     </w:p>
@@ -744,7 +814,7 @@
                     <pic:cNvPicPr/>
                   </pic:nvPicPr>
                   <pic:blipFill>
-                    <a:blip r:embed="rId8"/>
+                    <a:blip r:embed="rId9"/>
                     <a:stretch>
                       <a:fillRect/>
                     </a:stretch>
@@ -811,6 +881,7 @@
           <w:sz w:val="24"/>
           <w:szCs w:val="24"/>
         </w:rPr>
+        <w:lastRenderedPageBreak/>
         <w:drawing>
           <wp:inline distT="0" distB="0" distL="0" distR="0" wp14:anchorId="196A24FD" wp14:editId="7FBE8011">
             <wp:extent cx="3884878" cy="5469637"/>
@@ -827,7 +898,7 @@
                     <pic:cNvPicPr/>
                   </pic:nvPicPr>
                   <pic:blipFill>
-                    <a:blip r:embed="rId9"/>
+                    <a:blip r:embed="rId10"/>
                     <a:stretch>
                       <a:fillRect/>
                     </a:stretch>
@@ -887,7 +958,7 @@
                     <pic:cNvPicPr/>
                   </pic:nvPicPr>
                   <pic:blipFill>
-                    <a:blip r:embed="rId10"/>
+                    <a:blip r:embed="rId11"/>
                     <a:stretch>
                       <a:fillRect/>
                     </a:stretch>
@@ -921,6 +992,7 @@
         <w:rPr>
           <w:noProof/>
         </w:rPr>
+        <w:lastRenderedPageBreak/>
         <w:drawing>
           <wp:inline distT="0" distB="0" distL="0" distR="0" wp14:anchorId="03DEFD87" wp14:editId="1CB0D905">
             <wp:extent cx="2692538" cy="1320868"/>
@@ -937,7 +1009,7 @@
                     <pic:cNvPicPr/>
                   </pic:nvPicPr>
                   <pic:blipFill>
-                    <a:blip r:embed="rId11"/>
+                    <a:blip r:embed="rId12"/>
                     <a:stretch>
                       <a:fillRect/>
                     </a:stretch>
@@ -987,7 +1059,7 @@
                     <pic:cNvPicPr/>
                   </pic:nvPicPr>
                   <pic:blipFill>
-                    <a:blip r:embed="rId12"/>
+                    <a:blip r:embed="rId13"/>
                     <a:stretch>
                       <a:fillRect/>
                     </a:stretch>
@@ -1050,7 +1122,21 @@
         <w:rPr>
           <w:lang w:val="en-PK"/>
         </w:rPr>
-        <w:t>new int[n] can create an array using a runtime size. int marks[n] is not standard C++ when n is entered at runtime.</w:t>
+        <w:t xml:space="preserve">new int[n] can create an array using a runtime size. int marks[n] </w:t>
+      </w:r>
+      <w:proofErr w:type="gramStart"/>
+      <w:r>
+        <w:rPr>
+          <w:lang w:val="en-PK"/>
+        </w:rPr>
+        <w:t>is</w:t>
+      </w:r>
+      <w:proofErr w:type="gramEnd"/>
+      <w:r>
+        <w:rPr>
+          <w:lang w:val="en-PK"/>
+        </w:rPr>
+        <w:t xml:space="preserve"> not standard C++ when n is entered at runtime.</w:t>
       </w:r>
     </w:p>
     <w:p>
@@ -1108,18 +1194,18 @@
           <w:sz w:val="34"/>
           <w:szCs w:val="34"/>
         </w:rPr>
+        <w:t>Task 3:</w:t>
+      </w:r>
+    </w:p>
+    <w:p>
+      <w:pPr>
+        <w:jc w:val="center"/>
+      </w:pPr>
+      <w:r>
+        <w:rPr>
+          <w:noProof/>
+        </w:rPr>
         <w:lastRenderedPageBreak/>
-        <w:t>Task 3:</w:t>
-      </w:r>
-    </w:p>
-    <w:p>
-      <w:pPr>
-        <w:jc w:val="center"/>
-      </w:pPr>
-      <w:r>
-        <w:rPr>
-          <w:noProof/>
-        </w:rPr>
         <w:drawing>
           <wp:inline distT="0" distB="0" distL="0" distR="0" wp14:anchorId="3A7FA371" wp14:editId="47F8D57F">
             <wp:extent cx="6108846" cy="7119634"/>
@@ -1136,7 +1222,7 @@
                     <pic:cNvPicPr/>
                   </pic:nvPicPr>
                   <pic:blipFill>
-                    <a:blip r:embed="rId13"/>
+                    <a:blip r:embed="rId14"/>
                     <a:stretch>
                       <a:fillRect/>
                     </a:stretch>
@@ -1194,7 +1280,7 @@
                     <pic:cNvPicPr/>
                   </pic:nvPicPr>
                   <pic:blipFill>
-                    <a:blip r:embed="rId14"/>
+                    <a:blip r:embed="rId15"/>
                     <a:stretch>
                       <a:fillRect/>
                     </a:stretch>
@@ -1246,11 +1332,19 @@
       </w:r>
     </w:p>
     <w:p>
+      <w:proofErr w:type="spellStart"/>
       <w:r>
         <w:rPr>
           <w:lang w:val="en-PK"/>
         </w:rPr>
-        <w:t>rowPtr + 1 moves to the next row. int** is not correct for this type of normal 2D array.</w:t>
+        <w:t>rowPtr</w:t>
+      </w:r>
+      <w:proofErr w:type="spellEnd"/>
+      <w:r>
+        <w:rPr>
+          <w:lang w:val="en-PK"/>
+        </w:rPr>
+        <w:t xml:space="preserve"> + 1 moves to the next row. int** is not correct for this type of normal 2D array.</w:t>
       </w:r>
     </w:p>
     <w:p>
@@ -1389,6 +1483,7 @@
           <w:sz w:val="34"/>
           <w:szCs w:val="34"/>
         </w:rPr>
+        <w:lastRenderedPageBreak/>
         <w:t>Task 4:</w:t>
       </w:r>
     </w:p>
@@ -1397,7 +1492,9 @@
         <w:jc w:val="center"/>
       </w:pPr>
       <w:r>
-        <w:lastRenderedPageBreak/>
+        <w:rPr>
+          <w:noProof/>
+        </w:rPr>
         <w:drawing>
           <wp:inline distT="0" distB="0" distL="0" distR="0" wp14:anchorId="2B49CF7B" wp14:editId="01063878">
             <wp:extent cx="3451463" cy="7567888"/>
@@ -1414,7 +1511,7 @@
                     <pic:cNvPicPr/>
                   </pic:nvPicPr>
                   <pic:blipFill>
-                    <a:blip r:embed="rId15"/>
+                    <a:blip r:embed="rId16"/>
                     <a:stretch>
                       <a:fillRect/>
                     </a:stretch>
@@ -1479,7 +1576,21 @@
         <w:rPr>
           <w:lang w:val="en-PK"/>
         </w:rPr>
-        <w:t>marks points to the row pointers, while marks[0] points to the first row. Every allocated row must be deleted to prevent memory leaks.</w:t>
+        <w:t xml:space="preserve">marks points to the row pointers, while </w:t>
+      </w:r>
+      <w:proofErr w:type="gramStart"/>
+      <w:r>
+        <w:rPr>
+          <w:lang w:val="en-PK"/>
+        </w:rPr>
+        <w:t>marks[</w:t>
+      </w:r>
+      <w:proofErr w:type="gramEnd"/>
+      <w:r>
+        <w:rPr>
+          <w:lang w:val="en-PK"/>
+        </w:rPr>
+        <w:t>0] points to the first row. Every allocated row must be deleted to prevent memory leaks.</w:t>
       </w:r>
     </w:p>
     <w:p>
@@ -1515,6 +1626,9 @@
         <w:jc w:val="center"/>
       </w:pPr>
       <w:r>
+        <w:rPr>
+          <w:noProof/>
+        </w:rPr>
         <w:drawing>
           <wp:inline distT="0" distB="0" distL="0" distR="0" wp14:anchorId="0471A2AA" wp14:editId="1679F52E">
             <wp:extent cx="3086259" cy="2324219"/>
@@ -1531,7 +1645,7 @@
                     <pic:cNvPicPr/>
                   </pic:nvPicPr>
                   <pic:blipFill>
-                    <a:blip r:embed="rId16"/>
+                    <a:blip r:embed="rId17"/>
                     <a:stretch>
                       <a:fillRect/>
                     </a:stretch>
@@ -1562,6 +1676,9 @@
         <w:jc w:val="center"/>
       </w:pPr>
       <w:r>
+        <w:rPr>
+          <w:noProof/>
+        </w:rPr>
         <w:drawing>
           <wp:inline distT="0" distB="0" distL="0" distR="0" wp14:anchorId="44E22552" wp14:editId="32BE844B">
             <wp:extent cx="4076910" cy="2006703"/>
@@ -1578,7 +1695,7 @@
                     <pic:cNvPicPr/>
                   </pic:nvPicPr>
                   <pic:blipFill>
-                    <a:blip r:embed="rId17"/>
+                    <a:blip r:embed="rId18"/>
                     <a:stretch>
                       <a:fillRect/>
                     </a:stretch>
@@ -1664,6 +1781,7 @@
         <w:rPr>
           <w:b/>
           <w:bCs/>
+          <w:noProof/>
         </w:rPr>
         <w:drawing>
           <wp:inline distT="0" distB="0" distL="0" distR="0" wp14:anchorId="4B29AB26" wp14:editId="3AFEB952">
@@ -1681,7 +1799,7 @@
                     <pic:cNvPicPr/>
                   </pic:nvPicPr>
                   <pic:blipFill>
-                    <a:blip r:embed="rId18"/>
+                    <a:blip r:embed="rId19"/>
                     <a:stretch>
                       <a:fillRect/>
                     </a:stretch>
@@ -1734,6 +1852,7 @@
         <w:rPr>
           <w:b/>
           <w:bCs/>
+          <w:noProof/>
         </w:rPr>
         <w:drawing>
           <wp:inline distT="0" distB="0" distL="0" distR="0" wp14:anchorId="23DC9697" wp14:editId="6089E9A2">
@@ -1751,7 +1870,7 @@
                     <pic:cNvPicPr/>
                   </pic:nvPicPr>
                   <pic:blipFill>
-                    <a:blip r:embed="rId19"/>
+                    <a:blip r:embed="rId20"/>
                     <a:stretch>
                       <a:fillRect/>
                     </a:stretch>
@@ -1786,6 +1905,7 @@
         <w:rPr>
           <w:b/>
           <w:bCs/>
+          <w:noProof/>
         </w:rPr>
         <w:drawing>
           <wp:inline distT="0" distB="0" distL="0" distR="0" wp14:anchorId="0B0B700C" wp14:editId="50D62678">
@@ -1803,7 +1923,7 @@
                     <pic:cNvPicPr/>
                   </pic:nvPicPr>
                   <pic:blipFill>
-                    <a:blip r:embed="rId20"/>
+                    <a:blip r:embed="rId21"/>
                     <a:stretch>
                       <a:fillRect/>
                     </a:stretch>
@@ -2032,13 +2152,29 @@
           <w:sz w:val="32"/>
           <w:szCs w:val="32"/>
         </w:rPr>
-        <w:t>Out-of-bounds access</w:t>
-      </w:r>
+        <w:t>Out-of-</w:t>
+      </w:r>
+      <w:proofErr w:type="gramStart"/>
       <w:r>
         <w:rPr>
           <w:sz w:val="32"/>
           <w:szCs w:val="32"/>
         </w:rPr>
+        <w:t>bounds</w:t>
+      </w:r>
+      <w:proofErr w:type="gramEnd"/>
+      <w:r>
+        <w:rPr>
+          <w:sz w:val="32"/>
+          <w:szCs w:val="32"/>
+        </w:rPr>
+        <w:t xml:space="preserve"> access</w:t>
+      </w:r>
+      <w:r>
+        <w:rPr>
+          <w:sz w:val="32"/>
+          <w:szCs w:val="32"/>
+        </w:rPr>
         <w:t>:</w:t>
       </w:r>
     </w:p>
@@ -2056,33 +2192,149 @@
         </w:rPr>
         <w:t>“</w:t>
       </w:r>
+      <w:proofErr w:type="gramStart"/>
       <w:r>
         <w:rPr>
           <w:sz w:val="26"/>
           <w:szCs w:val="26"/>
         </w:rPr>
-        <w:t>for (int i = 0; i &lt;= n; i++)</w:t>
-      </w:r>
+        <w:t>for</w:t>
+      </w:r>
+      <w:proofErr w:type="gramEnd"/>
       <w:r>
         <w:rPr>
           <w:sz w:val="26"/>
           <w:szCs w:val="26"/>
         </w:rPr>
-        <w:t>”  should be like  “</w:t>
-      </w:r>
+        <w:t xml:space="preserve"> (int </w:t>
+      </w:r>
+      <w:proofErr w:type="spellStart"/>
       <w:r>
         <w:rPr>
           <w:sz w:val="26"/>
           <w:szCs w:val="26"/>
         </w:rPr>
-        <w:t>for (int i = 0; i &lt; n; i++)</w:t>
-      </w:r>
+        <w:t>i</w:t>
+      </w:r>
+      <w:proofErr w:type="spellEnd"/>
       <w:r>
         <w:rPr>
           <w:sz w:val="26"/>
           <w:szCs w:val="26"/>
         </w:rPr>
-        <w:t>”</w:t>
+        <w:t xml:space="preserve"> = 0; </w:t>
+      </w:r>
+      <w:proofErr w:type="spellStart"/>
+      <w:r>
+        <w:rPr>
+          <w:sz w:val="26"/>
+          <w:szCs w:val="26"/>
+        </w:rPr>
+        <w:t>i</w:t>
+      </w:r>
+      <w:proofErr w:type="spellEnd"/>
+      <w:r>
+        <w:rPr>
+          <w:sz w:val="26"/>
+          <w:szCs w:val="26"/>
+        </w:rPr>
+        <w:t xml:space="preserve"> &lt;= n; </w:t>
+      </w:r>
+      <w:proofErr w:type="spellStart"/>
+      <w:r>
+        <w:rPr>
+          <w:sz w:val="26"/>
+          <w:szCs w:val="26"/>
+        </w:rPr>
+        <w:t>i</w:t>
+      </w:r>
+      <w:proofErr w:type="spellEnd"/>
+      <w:r>
+        <w:rPr>
+          <w:sz w:val="26"/>
+          <w:szCs w:val="26"/>
+        </w:rPr>
+        <w:t>++</w:t>
+      </w:r>
+      <w:proofErr w:type="gramStart"/>
+      <w:r>
+        <w:rPr>
+          <w:sz w:val="26"/>
+          <w:szCs w:val="26"/>
+        </w:rPr>
+        <w:t>)”  should</w:t>
+      </w:r>
+      <w:proofErr w:type="gramEnd"/>
+      <w:r>
+        <w:rPr>
+          <w:sz w:val="26"/>
+          <w:szCs w:val="26"/>
+        </w:rPr>
+        <w:t xml:space="preserve"> be </w:t>
+      </w:r>
+      <w:proofErr w:type="gramStart"/>
+      <w:r>
+        <w:rPr>
+          <w:sz w:val="26"/>
+          <w:szCs w:val="26"/>
+        </w:rPr>
+        <w:t>like  “</w:t>
+      </w:r>
+      <w:proofErr w:type="gramEnd"/>
+      <w:r>
+        <w:rPr>
+          <w:sz w:val="26"/>
+          <w:szCs w:val="26"/>
+        </w:rPr>
+        <w:t xml:space="preserve">for (int </w:t>
+      </w:r>
+      <w:proofErr w:type="spellStart"/>
+      <w:r>
+        <w:rPr>
+          <w:sz w:val="26"/>
+          <w:szCs w:val="26"/>
+        </w:rPr>
+        <w:t>i</w:t>
+      </w:r>
+      <w:proofErr w:type="spellEnd"/>
+      <w:r>
+        <w:rPr>
+          <w:sz w:val="26"/>
+          <w:szCs w:val="26"/>
+        </w:rPr>
+        <w:t xml:space="preserve"> = 0; </w:t>
+      </w:r>
+      <w:proofErr w:type="spellStart"/>
+      <w:r>
+        <w:rPr>
+          <w:sz w:val="26"/>
+          <w:szCs w:val="26"/>
+        </w:rPr>
+        <w:t>i</w:t>
+      </w:r>
+      <w:proofErr w:type="spellEnd"/>
+      <w:r>
+        <w:rPr>
+          <w:sz w:val="26"/>
+          <w:szCs w:val="26"/>
+        </w:rPr>
+        <w:t xml:space="preserve"> &lt; n; </w:t>
+      </w:r>
+      <w:proofErr w:type="spellStart"/>
+      <w:r>
+        <w:rPr>
+          <w:sz w:val="26"/>
+          <w:szCs w:val="26"/>
+        </w:rPr>
+        <w:t>i</w:t>
+      </w:r>
+      <w:proofErr w:type="spellEnd"/>
+      <w:r>
+        <w:rPr>
+          <w:sz w:val="26"/>
+          <w:szCs w:val="26"/>
+        </w:rPr>
+        <w:t>++)”</w:t>
       </w:r>
       <w:r>
         <w:rPr>
@@ -2126,33 +2378,53 @@
         </w:rPr>
         <w:t>“</w:t>
       </w:r>
+      <w:proofErr w:type="gramStart"/>
       <w:r>
         <w:rPr>
           <w:sz w:val="26"/>
           <w:szCs w:val="26"/>
         </w:rPr>
-        <w:t>delete values</w:t>
-      </w:r>
+        <w:t>delete</w:t>
+      </w:r>
+      <w:proofErr w:type="gramEnd"/>
       <w:r>
         <w:rPr>
           <w:sz w:val="26"/>
           <w:szCs w:val="26"/>
         </w:rPr>
-        <w:t>”   should be like  “</w:t>
-      </w:r>
+        <w:t xml:space="preserve"> </w:t>
+      </w:r>
+      <w:proofErr w:type="gramStart"/>
       <w:r>
         <w:rPr>
           <w:sz w:val="26"/>
           <w:szCs w:val="26"/>
         </w:rPr>
-        <w:t>delete[] values</w:t>
-      </w:r>
+        <w:t xml:space="preserve">values”   </w:t>
+      </w:r>
+      <w:proofErr w:type="gramEnd"/>
       <w:r>
         <w:rPr>
           <w:sz w:val="26"/>
           <w:szCs w:val="26"/>
         </w:rPr>
-        <w:t>”</w:t>
+        <w:t xml:space="preserve">should be </w:t>
+      </w:r>
+      <w:proofErr w:type="gramStart"/>
+      <w:r>
+        <w:rPr>
+          <w:sz w:val="26"/>
+          <w:szCs w:val="26"/>
+        </w:rPr>
+        <w:t>like  “delete[</w:t>
+      </w:r>
+      <w:proofErr w:type="gramEnd"/>
+      <w:r>
+        <w:rPr>
+          <w:sz w:val="26"/>
+          <w:szCs w:val="26"/>
+        </w:rPr>
+        <w:t>] values”</w:t>
       </w:r>
     </w:p>
     <w:p>
@@ -2180,14 +2452,7 @@
           <w:sz w:val="32"/>
           <w:szCs w:val="32"/>
         </w:rPr>
-        <w:t>Using a dangling pointer</w:t>
-      </w:r>
-      <w:r>
-        <w:rPr>
-          <w:sz w:val="32"/>
-          <w:szCs w:val="32"/>
-        </w:rPr>
-        <w:t>:</w:t>
+        <w:t>Using a dangling pointer:</w:t>
       </w:r>
     </w:p>
     <w:p>
@@ -2204,26 +2469,83 @@
         </w:rPr>
         <w:t>“</w:t>
       </w:r>
+      <w:proofErr w:type="spellStart"/>
       <w:r>
         <w:rPr>
           <w:sz w:val="26"/>
           <w:szCs w:val="26"/>
         </w:rPr>
-        <w:t>cout &lt;&lt; values[0];</w:t>
-      </w:r>
+        <w:t>cout</w:t>
+      </w:r>
+      <w:proofErr w:type="spellEnd"/>
       <w:r>
         <w:rPr>
           <w:sz w:val="26"/>
           <w:szCs w:val="26"/>
         </w:rPr>
-        <w:t>”</w:t>
-      </w:r>
+        <w:t xml:space="preserve"> &lt;&lt; </w:t>
+      </w:r>
+      <w:proofErr w:type="gramStart"/>
       <w:r>
         <w:rPr>
           <w:sz w:val="26"/>
           <w:szCs w:val="26"/>
         </w:rPr>
-        <w:t xml:space="preserve">  is wrong because values has already been released.</w:t>
+        <w:t>values[</w:t>
+      </w:r>
+      <w:proofErr w:type="gramEnd"/>
+      <w:r>
+        <w:rPr>
+          <w:sz w:val="26"/>
+          <w:szCs w:val="26"/>
+        </w:rPr>
+        <w:t>0]</w:t>
+      </w:r>
+      <w:proofErr w:type="gramStart"/>
+      <w:r>
+        <w:rPr>
+          <w:sz w:val="26"/>
+          <w:szCs w:val="26"/>
+        </w:rPr>
+        <w:t>;</w:t>
+      </w:r>
+      <w:r>
+        <w:rPr>
+          <w:sz w:val="26"/>
+          <w:szCs w:val="26"/>
+        </w:rPr>
+        <w:t>”</w:t>
+      </w:r>
+      <w:r>
+        <w:rPr>
+          <w:sz w:val="26"/>
+          <w:szCs w:val="26"/>
+        </w:rPr>
+        <w:t xml:space="preserve">  is</w:t>
+      </w:r>
+      <w:proofErr w:type="gramEnd"/>
+      <w:r>
+        <w:rPr>
+          <w:sz w:val="26"/>
+          <w:szCs w:val="26"/>
+        </w:rPr>
+        <w:t xml:space="preserve"> wrong because values </w:t>
+      </w:r>
+      <w:proofErr w:type="gramStart"/>
+      <w:r>
+        <w:rPr>
+          <w:sz w:val="26"/>
+          <w:szCs w:val="26"/>
+        </w:rPr>
+        <w:t>has</w:t>
+      </w:r>
+      <w:proofErr w:type="gramEnd"/>
+      <w:r>
+        <w:rPr>
+          <w:sz w:val="26"/>
+          <w:szCs w:val="26"/>
+        </w:rPr>
+        <w:t xml:space="preserve"> already been released.</w:t>
       </w:r>
     </w:p>
     <w:p>
@@ -2240,6 +2562,7 @@
         <w:rPr>
           <w:b/>
           <w:bCs/>
+          <w:noProof/>
         </w:rPr>
         <w:drawing>
           <wp:inline distT="0" distB="0" distL="0" distR="0" wp14:anchorId="2E1DCFC4" wp14:editId="48B860CD">
@@ -2257,7 +2580,7 @@
                     <pic:cNvPicPr/>
                   </pic:nvPicPr>
                   <pic:blipFill>
-                    <a:blip r:embed="rId21"/>
+                    <a:blip r:embed="rId22"/>
                     <a:stretch>
                       <a:fillRect/>
                     </a:stretch>
@@ -2310,6 +2633,7 @@
         <w:rPr>
           <w:b/>
           <w:bCs/>
+          <w:noProof/>
         </w:rPr>
         <w:drawing>
           <wp:inline distT="0" distB="0" distL="0" distR="0" wp14:anchorId="2ABD60BE" wp14:editId="3E352FB7">
@@ -2327,7 +2651,7 @@
                     <pic:cNvPicPr/>
                   </pic:nvPicPr>
                   <pic:blipFill>
-                    <a:blip r:embed="rId22"/>
+                    <a:blip r:embed="rId23"/>
                     <a:stretch>
                       <a:fillRect/>
                     </a:stretch>
@@ -2362,6 +2686,7 @@
         <w:rPr>
           <w:b/>
           <w:bCs/>
+          <w:noProof/>
         </w:rPr>
         <w:drawing>
           <wp:inline distT="0" distB="0" distL="0" distR="0" wp14:anchorId="1F88543A" wp14:editId="4C13ECF7">
@@ -2379,7 +2704,7 @@
                     <pic:cNvPicPr/>
                   </pic:nvPicPr>
                   <pic:blipFill>
-                    <a:blip r:embed="rId23"/>
+                    <a:blip r:embed="rId24"/>
                     <a:stretch>
                       <a:fillRect/>
                     </a:stretch>
@@ -2494,8 +2819,8 @@
     </w:p>
     <w:p/>
     <w:sectPr>
-      <w:headerReference w:type="default" r:id="rId24"/>
-      <w:footerReference w:type="default" r:id="rId25"/>
+      <w:headerReference w:type="default" r:id="rId25"/>
+      <w:footerReference w:type="default" r:id="rId26"/>
       <w:pgSz w:w="12240" w:h="15840"/>
       <w:pgMar w:top="720" w:right="720" w:bottom="720" w:left="720" w:header="720" w:footer="720" w:gutter="0"/>
       <w:pgNumType w:start="1"/>
@@ -3487,6 +3812,7 @@
   <w:style w:type="character" w:default="1" w:styleId="DefaultParagraphFont">
     <w:name w:val="Default Paragraph Font"/>
     <w:uiPriority w:val="1"/>
+    <w:semiHidden/>
     <w:unhideWhenUsed/>
   </w:style>
   <w:style w:type="table" w:default="1" w:styleId="TableNormal">
@@ -3564,6 +3890,41 @@
       <w:ind w:left="720"/>
       <w:contextualSpacing/>
     </w:pPr>
+  </w:style>
+  <w:style w:type="character" w:styleId="Hyperlink">
+    <w:name w:val="Hyperlink"/>
+    <w:basedOn w:val="DefaultParagraphFont"/>
+    <w:uiPriority w:val="99"/>
+    <w:unhideWhenUsed/>
+    <w:rsid w:val="009468EB"/>
+    <w:rPr>
+      <w:color w:val="0000FF" w:themeColor="hyperlink"/>
+      <w:u w:val="single"/>
+    </w:rPr>
+  </w:style>
+  <w:style w:type="character" w:styleId="UnresolvedMention">
+    <w:name w:val="Unresolved Mention"/>
+    <w:basedOn w:val="DefaultParagraphFont"/>
+    <w:uiPriority w:val="99"/>
+    <w:semiHidden/>
+    <w:unhideWhenUsed/>
+    <w:rsid w:val="009468EB"/>
+    <w:rPr>
+      <w:color w:val="605E5C"/>
+      <w:shd w:val="clear" w:color="auto" w:fill="E1DFDD"/>
+    </w:rPr>
+  </w:style>
+  <w:style w:type="character" w:styleId="FollowedHyperlink">
+    <w:name w:val="FollowedHyperlink"/>
+    <w:basedOn w:val="DefaultParagraphFont"/>
+    <w:uiPriority w:val="99"/>
+    <w:semiHidden/>
+    <w:unhideWhenUsed/>
+    <w:rsid w:val="009468EB"/>
+    <w:rPr>
+      <w:color w:val="800080" w:themeColor="followedHyperlink"/>
+      <w:u w:val="single"/>
+    </w:rPr>
   </w:style>
 </w:styles>
 </file>

</xml_diff>